<commit_message>
Supp. Figures and Tables Edits
</commit_message>
<xml_diff>
--- a/Manuscript/Supplemental Figures & Tables - Phenols Analysis.docx
+++ b/Manuscript/Supplemental Figures & Tables - Phenols Analysis.docx
@@ -216,22 +216,34 @@
                               </w:rPr>
                               <w:t xml:space="preserve"> with available </w:t>
                             </w:r>
-                            <w:r>
-                              <w:rPr>
-                                <w:rFonts w:ascii="Times New Roman" w:hAnsi="Times New Roman" w:cs="Times New Roman"/>
-                                <w:sz w:val="28"/>
-                                <w:szCs w:val="28"/>
-                              </w:rPr>
-                              <w:t>Phenol</w:t>
-                            </w:r>
-                            <w:r>
-                              <w:rPr>
-                                <w:rFonts w:ascii="Times New Roman" w:hAnsi="Times New Roman" w:cs="Times New Roman"/>
-                                <w:sz w:val="28"/>
-                                <w:szCs w:val="28"/>
-                              </w:rPr>
-                              <w:t>s</w:t>
-                            </w:r>
+                            <w:del w:id="0" w:author="Nickelberry, Marshae" w:date="2026-02-06T12:40:00Z" w16du:dateUtc="2026-02-06T17:40:00Z">
+                              <w:r>
+                                <w:rPr>
+                                  <w:rFonts w:ascii="Times New Roman" w:hAnsi="Times New Roman" w:cs="Times New Roman"/>
+                                  <w:sz w:val="28"/>
+                                  <w:szCs w:val="28"/>
+                                </w:rPr>
+                                <w:delText>Phenol</w:delText>
+                              </w:r>
+                              <w:r>
+                                <w:rPr>
+                                  <w:rFonts w:ascii="Times New Roman" w:hAnsi="Times New Roman" w:cs="Times New Roman"/>
+                                  <w:sz w:val="28"/>
+                                  <w:szCs w:val="28"/>
+                                </w:rPr>
+                                <w:delText>s</w:delText>
+                              </w:r>
+                            </w:del>
+                            <w:ins w:id="1" w:author="Nickelberry, Marshae" w:date="2026-02-06T12:40:00Z" w16du:dateUtc="2026-02-06T17:40:00Z">
+                              <w:r>
+                                <w:rPr>
+                                  <w:rFonts w:ascii="Times New Roman" w:hAnsi="Times New Roman" w:cs="Times New Roman"/>
+                                  <w:sz w:val="28"/>
+                                  <w:szCs w:val="28"/>
+                                </w:rPr>
+                                <w:t>phenols</w:t>
+                              </w:r>
+                            </w:ins>
                             <w:r>
                               <w:rPr>
                                 <w:rFonts w:ascii="Times New Roman" w:hAnsi="Times New Roman" w:cs="Times New Roman"/>
@@ -264,14 +276,26 @@
                               </w:rPr>
                               <w:t xml:space="preserve"> demographic data</w:t>
                             </w:r>
-                            <w:r>
-                              <w:rPr>
-                                <w:rFonts w:ascii="Times New Roman" w:hAnsi="Times New Roman" w:cs="Times New Roman"/>
-                                <w:sz w:val="28"/>
-                                <w:szCs w:val="28"/>
-                              </w:rPr>
-                              <w:t xml:space="preserve"> </w:t>
-                            </w:r>
+                            <w:ins w:id="2" w:author="Nickelberry, Marshae" w:date="2026-02-06T12:40:00Z" w16du:dateUtc="2026-02-06T17:40:00Z">
+                              <w:r>
+                                <w:rPr>
+                                  <w:rFonts w:ascii="Times New Roman" w:hAnsi="Times New Roman" w:cs="Times New Roman"/>
+                                  <w:sz w:val="28"/>
+                                  <w:szCs w:val="28"/>
+                                </w:rPr>
+                                <w:t>.</w:t>
+                              </w:r>
+                            </w:ins>
+                            <w:del w:id="3" w:author="Nickelberry, Marshae" w:date="2026-02-06T12:40:00Z" w16du:dateUtc="2026-02-06T17:40:00Z">
+                              <w:r>
+                                <w:rPr>
+                                  <w:rFonts w:ascii="Times New Roman" w:hAnsi="Times New Roman" w:cs="Times New Roman"/>
+                                  <w:sz w:val="28"/>
+                                  <w:szCs w:val="28"/>
+                                </w:rPr>
+                                <w:delText xml:space="preserve"> </w:delText>
+                              </w:r>
+                            </w:del>
                           </w:p>
                         </w:txbxContent>
                       </wps:txbx>
@@ -349,22 +373,34 @@
                         </w:rPr>
                         <w:t xml:space="preserve"> with available </w:t>
                       </w:r>
-                      <w:r>
-                        <w:rPr>
-                          <w:rFonts w:ascii="Times New Roman" w:hAnsi="Times New Roman" w:cs="Times New Roman"/>
-                          <w:sz w:val="28"/>
-                          <w:szCs w:val="28"/>
-                        </w:rPr>
-                        <w:t>Phenol</w:t>
-                      </w:r>
-                      <w:r>
-                        <w:rPr>
-                          <w:rFonts w:ascii="Times New Roman" w:hAnsi="Times New Roman" w:cs="Times New Roman"/>
-                          <w:sz w:val="28"/>
-                          <w:szCs w:val="28"/>
-                        </w:rPr>
-                        <w:t>s</w:t>
-                      </w:r>
+                      <w:del w:id="4" w:author="Nickelberry, Marshae" w:date="2026-02-06T12:40:00Z" w16du:dateUtc="2026-02-06T17:40:00Z">
+                        <w:r>
+                          <w:rPr>
+                            <w:rFonts w:ascii="Times New Roman" w:hAnsi="Times New Roman" w:cs="Times New Roman"/>
+                            <w:sz w:val="28"/>
+                            <w:szCs w:val="28"/>
+                          </w:rPr>
+                          <w:delText>Phenol</w:delText>
+                        </w:r>
+                        <w:r>
+                          <w:rPr>
+                            <w:rFonts w:ascii="Times New Roman" w:hAnsi="Times New Roman" w:cs="Times New Roman"/>
+                            <w:sz w:val="28"/>
+                            <w:szCs w:val="28"/>
+                          </w:rPr>
+                          <w:delText>s</w:delText>
+                        </w:r>
+                      </w:del>
+                      <w:ins w:id="5" w:author="Nickelberry, Marshae" w:date="2026-02-06T12:40:00Z" w16du:dateUtc="2026-02-06T17:40:00Z">
+                        <w:r>
+                          <w:rPr>
+                            <w:rFonts w:ascii="Times New Roman" w:hAnsi="Times New Roman" w:cs="Times New Roman"/>
+                            <w:sz w:val="28"/>
+                            <w:szCs w:val="28"/>
+                          </w:rPr>
+                          <w:t>phenols</w:t>
+                        </w:r>
+                      </w:ins>
                       <w:r>
                         <w:rPr>
                           <w:rFonts w:ascii="Times New Roman" w:hAnsi="Times New Roman" w:cs="Times New Roman"/>
@@ -397,14 +433,26 @@
                         </w:rPr>
                         <w:t xml:space="preserve"> demographic data</w:t>
                       </w:r>
-                      <w:r>
-                        <w:rPr>
-                          <w:rFonts w:ascii="Times New Roman" w:hAnsi="Times New Roman" w:cs="Times New Roman"/>
-                          <w:sz w:val="28"/>
-                          <w:szCs w:val="28"/>
-                        </w:rPr>
-                        <w:t xml:space="preserve"> </w:t>
-                      </w:r>
+                      <w:ins w:id="6" w:author="Nickelberry, Marshae" w:date="2026-02-06T12:40:00Z" w16du:dateUtc="2026-02-06T17:40:00Z">
+                        <w:r>
+                          <w:rPr>
+                            <w:rFonts w:ascii="Times New Roman" w:hAnsi="Times New Roman" w:cs="Times New Roman"/>
+                            <w:sz w:val="28"/>
+                            <w:szCs w:val="28"/>
+                          </w:rPr>
+                          <w:t>.</w:t>
+                        </w:r>
+                      </w:ins>
+                      <w:del w:id="7" w:author="Nickelberry, Marshae" w:date="2026-02-06T12:40:00Z" w16du:dateUtc="2026-02-06T17:40:00Z">
+                        <w:r>
+                          <w:rPr>
+                            <w:rFonts w:ascii="Times New Roman" w:hAnsi="Times New Roman" w:cs="Times New Roman"/>
+                            <w:sz w:val="28"/>
+                            <w:szCs w:val="28"/>
+                          </w:rPr>
+                          <w:delText xml:space="preserve"> </w:delText>
+                        </w:r>
+                      </w:del>
                     </w:p>
                   </w:txbxContent>
                 </v:textbox>
@@ -493,14 +541,30 @@
                               <w:rPr>
                                 <w:rFonts w:ascii="Times New Roman" w:hAnsi="Times New Roman" w:cs="Times New Roman"/>
                               </w:rPr>
-                              <w:t xml:space="preserve"> participants </w:t>
+                              <w:t xml:space="preserve"> </w:t>
                             </w:r>
-                            <w:r>
-                              <w:rPr>
-                                <w:rFonts w:ascii="Times New Roman" w:hAnsi="Times New Roman" w:cs="Times New Roman"/>
-                              </w:rPr>
-                              <w:t>who identified as children</w:t>
-                            </w:r>
+                            <w:del w:id="4" w:author="Nickelberry, Marshae" w:date="2026-02-06T12:40:00Z" w16du:dateUtc="2026-02-06T17:40:00Z">
+                              <w:r>
+                                <w:rPr>
+                                  <w:rFonts w:ascii="Times New Roman" w:hAnsi="Times New Roman" w:cs="Times New Roman"/>
+                                </w:rPr>
+                                <w:delText xml:space="preserve">participants </w:delText>
+                              </w:r>
+                              <w:r>
+                                <w:rPr>
+                                  <w:rFonts w:ascii="Times New Roman" w:hAnsi="Times New Roman" w:cs="Times New Roman"/>
+                                </w:rPr>
+                                <w:delText>who identified as children</w:delText>
+                              </w:r>
+                            </w:del>
+                            <w:ins w:id="5" w:author="Nickelberry, Marshae" w:date="2026-02-06T12:40:00Z" w16du:dateUtc="2026-02-06T17:40:00Z">
+                              <w:r>
+                                <w:rPr>
+                                  <w:rFonts w:ascii="Times New Roman" w:hAnsi="Times New Roman" w:cs="Times New Roman"/>
+                                </w:rPr>
+                                <w:t>pediatric participants (ages?)</w:t>
+                              </w:r>
+                            </w:ins>
                             <w:r>
                               <w:rPr>
                                 <w:rFonts w:ascii="Times New Roman" w:hAnsi="Times New Roman" w:cs="Times New Roman"/>
@@ -562,14 +626,30 @@
                         <w:rPr>
                           <w:rFonts w:ascii="Times New Roman" w:hAnsi="Times New Roman" w:cs="Times New Roman"/>
                         </w:rPr>
-                        <w:t xml:space="preserve"> participants </w:t>
+                        <w:t xml:space="preserve"> </w:t>
                       </w:r>
-                      <w:r>
-                        <w:rPr>
-                          <w:rFonts w:ascii="Times New Roman" w:hAnsi="Times New Roman" w:cs="Times New Roman"/>
-                        </w:rPr>
-                        <w:t>who identified as children</w:t>
-                      </w:r>
+                      <w:del w:id="10" w:author="Nickelberry, Marshae" w:date="2026-02-06T12:40:00Z" w16du:dateUtc="2026-02-06T17:40:00Z">
+                        <w:r>
+                          <w:rPr>
+                            <w:rFonts w:ascii="Times New Roman" w:hAnsi="Times New Roman" w:cs="Times New Roman"/>
+                          </w:rPr>
+                          <w:delText xml:space="preserve">participants </w:delText>
+                        </w:r>
+                        <w:r>
+                          <w:rPr>
+                            <w:rFonts w:ascii="Times New Roman" w:hAnsi="Times New Roman" w:cs="Times New Roman"/>
+                          </w:rPr>
+                          <w:delText>who identified as children</w:delText>
+                        </w:r>
+                      </w:del>
+                      <w:ins w:id="11" w:author="Nickelberry, Marshae" w:date="2026-02-06T12:40:00Z" w16du:dateUtc="2026-02-06T17:40:00Z">
+                        <w:r>
+                          <w:rPr>
+                            <w:rFonts w:ascii="Times New Roman" w:hAnsi="Times New Roman" w:cs="Times New Roman"/>
+                          </w:rPr>
+                          <w:t>pediatric participants (ages?)</w:t>
+                        </w:r>
+                      </w:ins>
                       <w:r>
                         <w:rPr>
                           <w:rFonts w:ascii="Times New Roman" w:hAnsi="Times New Roman" w:cs="Times New Roman"/>
@@ -785,37 +865,59 @@
                               </w:rPr>
                               <w:t xml:space="preserve">participants with </w:t>
                             </w:r>
+                            <w:del w:id="6" w:author="Nickelberry, Marshae" w:date="2026-02-06T12:48:00Z" w16du:dateUtc="2026-02-06T17:48:00Z">
+                              <w:r>
+                                <w:rPr>
+                                  <w:rFonts w:ascii="Times New Roman" w:hAnsi="Times New Roman" w:cs="Times New Roman"/>
+                                  <w:sz w:val="28"/>
+                                  <w:szCs w:val="28"/>
+                                </w:rPr>
+                                <w:delText>(n=</w:delText>
+                              </w:r>
+                              <w:r>
+                                <w:rPr>
+                                  <w:rFonts w:ascii="Times New Roman" w:hAnsi="Times New Roman" w:cs="Times New Roman"/>
+                                  <w:sz w:val="28"/>
+                                  <w:szCs w:val="28"/>
+                                </w:rPr>
+                                <w:delText>9</w:delText>
+                              </w:r>
+                              <w:r>
+                                <w:rPr>
+                                  <w:rFonts w:ascii="Times New Roman" w:hAnsi="Times New Roman" w:cs="Times New Roman"/>
+                                  <w:sz w:val="28"/>
+                                  <w:szCs w:val="28"/>
+                                </w:rPr>
+                                <w:delText xml:space="preserve"> </w:delText>
+                              </w:r>
+                            </w:del>
+                            <w:ins w:id="7" w:author="Nickelberry, Marshae" w:date="2026-02-06T12:40:00Z" w16du:dateUtc="2026-02-06T17:40:00Z">
+                              <w:r>
+                                <w:rPr>
+                                  <w:rFonts w:ascii="Times New Roman" w:hAnsi="Times New Roman" w:cs="Times New Roman"/>
+                                  <w:sz w:val="28"/>
+                                  <w:szCs w:val="28"/>
+                                </w:rPr>
+                                <w:t>p</w:t>
+                              </w:r>
+                            </w:ins>
+                            <w:del w:id="8" w:author="Nickelberry, Marshae" w:date="2026-02-06T12:40:00Z" w16du:dateUtc="2026-02-06T17:40:00Z">
+                              <w:r>
+                                <w:rPr>
+                                  <w:rFonts w:ascii="Times New Roman" w:hAnsi="Times New Roman" w:cs="Times New Roman"/>
+                                  <w:sz w:val="28"/>
+                                  <w:szCs w:val="28"/>
+                                </w:rPr>
+                                <w:delText>P</w:delText>
+                              </w:r>
+                            </w:del>
                             <w:r>
                               <w:rPr>
                                 <w:rFonts w:ascii="Times New Roman" w:hAnsi="Times New Roman" w:cs="Times New Roman"/>
                                 <w:sz w:val="28"/>
                                 <w:szCs w:val="28"/>
                               </w:rPr>
-                              <w:t>(n=</w:t>
-                            </w:r>
-                            <w:r>
-                              <w:rPr>
-                                <w:rFonts w:ascii="Times New Roman" w:hAnsi="Times New Roman" w:cs="Times New Roman"/>
-                                <w:sz w:val="28"/>
-                                <w:szCs w:val="28"/>
-                              </w:rPr>
-                              <w:t>9</w:t>
-                            </w:r>
-                            <w:r>
-                              <w:rPr>
-                                <w:rFonts w:ascii="Times New Roman" w:hAnsi="Times New Roman" w:cs="Times New Roman"/>
-                                <w:sz w:val="28"/>
-                                <w:szCs w:val="28"/>
-                              </w:rPr>
-                              <w:t xml:space="preserve"> </w:t>
-                            </w:r>
-                            <w:r>
-                              <w:rPr>
-                                <w:rFonts w:ascii="Times New Roman" w:hAnsi="Times New Roman" w:cs="Times New Roman"/>
-                                <w:sz w:val="28"/>
-                                <w:szCs w:val="28"/>
-                              </w:rPr>
-                              <w:t>Phenol</w:t>
+                              <w:t>henol</w:t>
                             </w:r>
                             <w:r>
                               <w:rPr>
@@ -857,14 +959,16 @@
                               </w:rPr>
                               <w:t>6</w:t>
                             </w:r>
-                            <w:r>
-                              <w:rPr>
-                                <w:rFonts w:ascii="Times New Roman" w:hAnsi="Times New Roman" w:cs="Times New Roman"/>
-                                <w:sz w:val="28"/>
-                                <w:szCs w:val="28"/>
-                              </w:rPr>
-                              <w:t>)</w:t>
-                            </w:r>
+                            <w:del w:id="9" w:author="Nickelberry, Marshae" w:date="2026-02-06T12:41:00Z" w16du:dateUtc="2026-02-06T17:41:00Z">
+                              <w:r>
+                                <w:rPr>
+                                  <w:rFonts w:ascii="Times New Roman" w:hAnsi="Times New Roman" w:cs="Times New Roman"/>
+                                  <w:sz w:val="28"/>
+                                  <w:szCs w:val="28"/>
+                                </w:rPr>
+                                <w:delText>)</w:delText>
+                              </w:r>
+                            </w:del>
                             <w:r>
                               <w:rPr>
                                 <w:rFonts w:ascii="Times New Roman" w:hAnsi="Times New Roman" w:cs="Times New Roman"/>
@@ -942,37 +1046,59 @@
                         </w:rPr>
                         <w:t xml:space="preserve">participants with </w:t>
                       </w:r>
+                      <w:del w:id="16" w:author="Nickelberry, Marshae" w:date="2026-02-06T12:48:00Z" w16du:dateUtc="2026-02-06T17:48:00Z">
+                        <w:r>
+                          <w:rPr>
+                            <w:rFonts w:ascii="Times New Roman" w:hAnsi="Times New Roman" w:cs="Times New Roman"/>
+                            <w:sz w:val="28"/>
+                            <w:szCs w:val="28"/>
+                          </w:rPr>
+                          <w:delText>(n=</w:delText>
+                        </w:r>
+                        <w:r>
+                          <w:rPr>
+                            <w:rFonts w:ascii="Times New Roman" w:hAnsi="Times New Roman" w:cs="Times New Roman"/>
+                            <w:sz w:val="28"/>
+                            <w:szCs w:val="28"/>
+                          </w:rPr>
+                          <w:delText>9</w:delText>
+                        </w:r>
+                        <w:r>
+                          <w:rPr>
+                            <w:rFonts w:ascii="Times New Roman" w:hAnsi="Times New Roman" w:cs="Times New Roman"/>
+                            <w:sz w:val="28"/>
+                            <w:szCs w:val="28"/>
+                          </w:rPr>
+                          <w:delText xml:space="preserve"> </w:delText>
+                        </w:r>
+                      </w:del>
+                      <w:ins w:id="17" w:author="Nickelberry, Marshae" w:date="2026-02-06T12:40:00Z" w16du:dateUtc="2026-02-06T17:40:00Z">
+                        <w:r>
+                          <w:rPr>
+                            <w:rFonts w:ascii="Times New Roman" w:hAnsi="Times New Roman" w:cs="Times New Roman"/>
+                            <w:sz w:val="28"/>
+                            <w:szCs w:val="28"/>
+                          </w:rPr>
+                          <w:t>p</w:t>
+                        </w:r>
+                      </w:ins>
+                      <w:del w:id="18" w:author="Nickelberry, Marshae" w:date="2026-02-06T12:40:00Z" w16du:dateUtc="2026-02-06T17:40:00Z">
+                        <w:r>
+                          <w:rPr>
+                            <w:rFonts w:ascii="Times New Roman" w:hAnsi="Times New Roman" w:cs="Times New Roman"/>
+                            <w:sz w:val="28"/>
+                            <w:szCs w:val="28"/>
+                          </w:rPr>
+                          <w:delText>P</w:delText>
+                        </w:r>
+                      </w:del>
                       <w:r>
                         <w:rPr>
                           <w:rFonts w:ascii="Times New Roman" w:hAnsi="Times New Roman" w:cs="Times New Roman"/>
                           <w:sz w:val="28"/>
                           <w:szCs w:val="28"/>
                         </w:rPr>
-                        <w:t>(n=</w:t>
-                      </w:r>
-                      <w:r>
-                        <w:rPr>
-                          <w:rFonts w:ascii="Times New Roman" w:hAnsi="Times New Roman" w:cs="Times New Roman"/>
-                          <w:sz w:val="28"/>
-                          <w:szCs w:val="28"/>
-                        </w:rPr>
-                        <w:t>9</w:t>
-                      </w:r>
-                      <w:r>
-                        <w:rPr>
-                          <w:rFonts w:ascii="Times New Roman" w:hAnsi="Times New Roman" w:cs="Times New Roman"/>
-                          <w:sz w:val="28"/>
-                          <w:szCs w:val="28"/>
-                        </w:rPr>
-                        <w:t xml:space="preserve"> </w:t>
-                      </w:r>
-                      <w:r>
-                        <w:rPr>
-                          <w:rFonts w:ascii="Times New Roman" w:hAnsi="Times New Roman" w:cs="Times New Roman"/>
-                          <w:sz w:val="28"/>
-                          <w:szCs w:val="28"/>
-                        </w:rPr>
-                        <w:t>Phenol</w:t>
+                        <w:t>henol</w:t>
                       </w:r>
                       <w:r>
                         <w:rPr>
@@ -1014,14 +1140,16 @@
                         </w:rPr>
                         <w:t>6</w:t>
                       </w:r>
-                      <w:r>
-                        <w:rPr>
-                          <w:rFonts w:ascii="Times New Roman" w:hAnsi="Times New Roman" w:cs="Times New Roman"/>
-                          <w:sz w:val="28"/>
-                          <w:szCs w:val="28"/>
-                        </w:rPr>
-                        <w:t>)</w:t>
-                      </w:r>
+                      <w:del w:id="19" w:author="Nickelberry, Marshae" w:date="2026-02-06T12:41:00Z" w16du:dateUtc="2026-02-06T17:41:00Z">
+                        <w:r>
+                          <w:rPr>
+                            <w:rFonts w:ascii="Times New Roman" w:hAnsi="Times New Roman" w:cs="Times New Roman"/>
+                            <w:sz w:val="28"/>
+                            <w:szCs w:val="28"/>
+                          </w:rPr>
+                          <w:delText>)</w:delText>
+                        </w:r>
+                      </w:del>
                       <w:r>
                         <w:rPr>
                           <w:rFonts w:ascii="Times New Roman" w:hAnsi="Times New Roman" w:cs="Times New Roman"/>
@@ -1197,7 +1325,35 @@
                               <w:rPr>
                                 <w:rFonts w:ascii="Times New Roman" w:hAnsi="Times New Roman" w:cs="Times New Roman"/>
                               </w:rPr>
-                              <w:t xml:space="preserve"> participants with missing creatinine, or exposure data</w:t>
+                              <w:t xml:space="preserve"> participants with missing creatinine, or </w:t>
+                            </w:r>
+                            <w:del w:id="10" w:author="Nickelberry, Marshae" w:date="2026-02-06T12:47:00Z" w16du:dateUtc="2026-02-06T17:47:00Z">
+                              <w:r>
+                                <w:rPr>
+                                  <w:rFonts w:ascii="Times New Roman" w:hAnsi="Times New Roman" w:cs="Times New Roman"/>
+                                </w:rPr>
+                                <w:delText xml:space="preserve">exposure </w:delText>
+                              </w:r>
+                            </w:del>
+                            <w:ins w:id="11" w:author="Nickelberry, Marshae" w:date="2026-02-06T12:47:00Z" w16du:dateUtc="2026-02-06T17:47:00Z">
+                              <w:r>
+                                <w:rPr>
+                                  <w:rFonts w:ascii="Times New Roman" w:hAnsi="Times New Roman" w:cs="Times New Roman"/>
+                                </w:rPr>
+                                <w:t>food security data</w:t>
+                              </w:r>
+                              <w:r>
+                                <w:rPr>
+                                  <w:rFonts w:ascii="Times New Roman" w:hAnsi="Times New Roman" w:cs="Times New Roman"/>
+                                </w:rPr>
+                                <w:t xml:space="preserve"> </w:t>
+                              </w:r>
+                            </w:ins>
+                            <w:r>
+                              <w:rPr>
+                                <w:rFonts w:ascii="Times New Roman" w:hAnsi="Times New Roman" w:cs="Times New Roman"/>
+                              </w:rPr>
+                              <w:t>data</w:t>
                             </w:r>
                           </w:p>
                         </w:txbxContent>
@@ -1250,7 +1406,35 @@
                         <w:rPr>
                           <w:rFonts w:ascii="Times New Roman" w:hAnsi="Times New Roman" w:cs="Times New Roman"/>
                         </w:rPr>
-                        <w:t xml:space="preserve"> participants with missing creatinine, or exposure data</w:t>
+                        <w:t xml:space="preserve"> participants with missing creatinine, or </w:t>
+                      </w:r>
+                      <w:del w:id="22" w:author="Nickelberry, Marshae" w:date="2026-02-06T12:47:00Z" w16du:dateUtc="2026-02-06T17:47:00Z">
+                        <w:r>
+                          <w:rPr>
+                            <w:rFonts w:ascii="Times New Roman" w:hAnsi="Times New Roman" w:cs="Times New Roman"/>
+                          </w:rPr>
+                          <w:delText xml:space="preserve">exposure </w:delText>
+                        </w:r>
+                      </w:del>
+                      <w:ins w:id="23" w:author="Nickelberry, Marshae" w:date="2026-02-06T12:47:00Z" w16du:dateUtc="2026-02-06T17:47:00Z">
+                        <w:r>
+                          <w:rPr>
+                            <w:rFonts w:ascii="Times New Roman" w:hAnsi="Times New Roman" w:cs="Times New Roman"/>
+                          </w:rPr>
+                          <w:t>food security data</w:t>
+                        </w:r>
+                        <w:r>
+                          <w:rPr>
+                            <w:rFonts w:ascii="Times New Roman" w:hAnsi="Times New Roman" w:cs="Times New Roman"/>
+                          </w:rPr>
+                          <w:t xml:space="preserve"> </w:t>
+                        </w:r>
+                      </w:ins>
+                      <w:r>
+                        <w:rPr>
+                          <w:rFonts w:ascii="Times New Roman" w:hAnsi="Times New Roman" w:cs="Times New Roman"/>
+                        </w:rPr>
+                        <w:t>data</w:t>
                       </w:r>
                     </w:p>
                   </w:txbxContent>
@@ -1613,8 +1797,38 @@
                               <w:rPr>
                                 <w:rFonts w:ascii="Times New Roman" w:hAnsi="Times New Roman" w:cs="Times New Roman"/>
                               </w:rPr>
-                              <w:t xml:space="preserve">Edit: Removed </w:t>
+                              <w:t>Edit:</w:t>
                             </w:r>
+                            <w:ins w:id="12" w:author="Nickelberry, Marshae" w:date="2026-02-06T12:42:00Z" w16du:dateUtc="2026-02-06T17:42:00Z">
+                              <w:r>
+                                <w:rPr>
+                                  <w:rFonts w:ascii="Times New Roman" w:hAnsi="Times New Roman" w:cs="Times New Roman"/>
+                                </w:rPr>
+                                <w:t xml:space="preserve"> (?)</w:t>
+                              </w:r>
+                            </w:ins>
+                            <w:r>
+                              <w:rPr>
+                                <w:rFonts w:ascii="Times New Roman" w:hAnsi="Times New Roman" w:cs="Times New Roman"/>
+                              </w:rPr>
+                              <w:t xml:space="preserve"> </w:t>
+                            </w:r>
+                            <w:del w:id="13" w:author="Nickelberry, Marshae" w:date="2026-02-06T12:42:00Z" w16du:dateUtc="2026-02-06T17:42:00Z">
+                              <w:r>
+                                <w:rPr>
+                                  <w:rFonts w:ascii="Times New Roman" w:hAnsi="Times New Roman" w:cs="Times New Roman"/>
+                                </w:rPr>
+                                <w:delText xml:space="preserve">Removed </w:delText>
+                              </w:r>
+                            </w:del>
+                            <w:ins w:id="14" w:author="Nickelberry, Marshae" w:date="2026-02-06T12:42:00Z" w16du:dateUtc="2026-02-06T17:42:00Z">
+                              <w:r>
+                                <w:rPr>
+                                  <w:rFonts w:ascii="Times New Roman" w:hAnsi="Times New Roman" w:cs="Times New Roman"/>
+                                </w:rPr>
+                                <w:t xml:space="preserve">Excluded </w:t>
+                              </w:r>
+                            </w:ins>
                             <w:r>
                               <w:rPr>
                                 <w:rFonts w:ascii="Times New Roman" w:hAnsi="Times New Roman" w:cs="Times New Roman"/>
@@ -1627,13 +1841,27 @@
                               <w:rPr>
                                 <w:rFonts w:ascii="Times New Roman" w:hAnsi="Times New Roman" w:cs="Times New Roman"/>
                               </w:rPr>
-                              <w:t xml:space="preserve"> participants </w:t>
+                              <w:t xml:space="preserve"> participants</w:t>
                             </w:r>
+                            <w:del w:id="15" w:author="Nickelberry, Marshae" w:date="2026-02-06T12:42:00Z" w16du:dateUtc="2026-02-06T17:42:00Z">
+                              <w:r>
+                                <w:rPr>
+                                  <w:rFonts w:ascii="Times New Roman" w:hAnsi="Times New Roman" w:cs="Times New Roman"/>
+                                </w:rPr>
+                                <w:delText xml:space="preserve"> </w:delText>
+                              </w:r>
+                              <w:r>
+                                <w:rPr>
+                                  <w:rFonts w:ascii="Times New Roman" w:hAnsi="Times New Roman" w:cs="Times New Roman"/>
+                                </w:rPr>
+                                <w:delText>after excluding Bisphenol F and Bisphenol S from the urinary phenol list</w:delText>
+                              </w:r>
+                            </w:del>
                             <w:r>
                               <w:rPr>
                                 <w:rFonts w:ascii="Times New Roman" w:hAnsi="Times New Roman" w:cs="Times New Roman"/>
                               </w:rPr>
-                              <w:t xml:space="preserve">after excluding Bisphenol F and Bisphenol S from the urinary phenol list, participants missing urinary </w:t>
+                              <w:t xml:space="preserve">, participants missing urinary </w:t>
                             </w:r>
                             <w:r>
                               <w:rPr>
@@ -1651,8 +1879,16 @@
                               <w:rPr>
                                 <w:rFonts w:ascii="Times New Roman" w:hAnsi="Times New Roman" w:cs="Times New Roman"/>
                               </w:rPr>
-                              <w:t xml:space="preserve"> concentration data, and the 2003–2004 cycle.</w:t>
+                              <w:t xml:space="preserve"> concentration data</w:t>
                             </w:r>
+                            <w:del w:id="16" w:author="Nickelberry, Marshae" w:date="2026-02-06T12:42:00Z" w16du:dateUtc="2026-02-06T17:42:00Z">
+                              <w:r>
+                                <w:rPr>
+                                  <w:rFonts w:ascii="Times New Roman" w:hAnsi="Times New Roman" w:cs="Times New Roman"/>
+                                </w:rPr>
+                                <w:delText>, and the 2003–2004 cycle.</w:delText>
+                              </w:r>
+                            </w:del>
                             <w:r>
                               <w:rPr>
                                 <w:rFonts w:ascii="Times New Roman" w:hAnsi="Times New Roman" w:cs="Times New Roman"/>
@@ -1698,8 +1934,44 @@
                         <w:rPr>
                           <w:rFonts w:ascii="Times New Roman" w:hAnsi="Times New Roman" w:cs="Times New Roman"/>
                         </w:rPr>
-                        <w:t xml:space="preserve">Edit: Removed </w:t>
+                        <w:t>Edit:</w:t>
                       </w:r>
+                      <w:ins w:id="29" w:author="Nickelberry, Marshae" w:date="2026-02-06T12:42:00Z" w16du:dateUtc="2026-02-06T17:42:00Z">
+                        <w:r>
+                          <w:rPr>
+                            <w:rFonts w:ascii="Times New Roman" w:hAnsi="Times New Roman" w:cs="Times New Roman"/>
+                          </w:rPr>
+                          <w:t xml:space="preserve"> (?)</w:t>
+                        </w:r>
+                      </w:ins>
+                      <w:r>
+                        <w:rPr>
+                          <w:rFonts w:ascii="Times New Roman" w:hAnsi="Times New Roman" w:cs="Times New Roman"/>
+                        </w:rPr>
+                        <w:t xml:space="preserve"> </w:t>
+                      </w:r>
+                      <w:del w:id="30" w:author="Nickelberry, Marshae" w:date="2026-02-06T12:42:00Z" w16du:dateUtc="2026-02-06T17:42:00Z">
+                        <w:r>
+                          <w:rPr>
+                            <w:rFonts w:ascii="Times New Roman" w:hAnsi="Times New Roman" w:cs="Times New Roman"/>
+                          </w:rPr>
+                          <w:delText xml:space="preserve">Removed </w:delText>
+                        </w:r>
+                      </w:del>
+                      <w:ins w:id="31" w:author="Nickelberry, Marshae" w:date="2026-02-06T12:42:00Z" w16du:dateUtc="2026-02-06T17:42:00Z">
+                        <w:r>
+                          <w:rPr>
+                            <w:rFonts w:ascii="Times New Roman" w:hAnsi="Times New Roman" w:cs="Times New Roman"/>
+                          </w:rPr>
+                          <w:t>Excluded</w:t>
+                        </w:r>
+                        <w:r>
+                          <w:rPr>
+                            <w:rFonts w:ascii="Times New Roman" w:hAnsi="Times New Roman" w:cs="Times New Roman"/>
+                          </w:rPr>
+                          <w:t xml:space="preserve"> </w:t>
+                        </w:r>
+                      </w:ins>
                       <w:r>
                         <w:rPr>
                           <w:rFonts w:ascii="Times New Roman" w:hAnsi="Times New Roman" w:cs="Times New Roman"/>
@@ -1712,13 +1984,27 @@
                         <w:rPr>
                           <w:rFonts w:ascii="Times New Roman" w:hAnsi="Times New Roman" w:cs="Times New Roman"/>
                         </w:rPr>
-                        <w:t xml:space="preserve"> participants </w:t>
+                        <w:t xml:space="preserve"> participants</w:t>
                       </w:r>
+                      <w:del w:id="32" w:author="Nickelberry, Marshae" w:date="2026-02-06T12:42:00Z" w16du:dateUtc="2026-02-06T17:42:00Z">
+                        <w:r>
+                          <w:rPr>
+                            <w:rFonts w:ascii="Times New Roman" w:hAnsi="Times New Roman" w:cs="Times New Roman"/>
+                          </w:rPr>
+                          <w:delText xml:space="preserve"> </w:delText>
+                        </w:r>
+                        <w:r>
+                          <w:rPr>
+                            <w:rFonts w:ascii="Times New Roman" w:hAnsi="Times New Roman" w:cs="Times New Roman"/>
+                          </w:rPr>
+                          <w:delText>after excluding Bisphenol F and Bisphenol S from the urinary phenol list</w:delText>
+                        </w:r>
+                      </w:del>
                       <w:r>
                         <w:rPr>
                           <w:rFonts w:ascii="Times New Roman" w:hAnsi="Times New Roman" w:cs="Times New Roman"/>
                         </w:rPr>
-                        <w:t xml:space="preserve">after excluding Bisphenol F and Bisphenol S from the urinary phenol list, participants missing urinary </w:t>
+                        <w:t xml:space="preserve">, participants missing urinary </w:t>
                       </w:r>
                       <w:r>
                         <w:rPr>
@@ -1736,8 +2022,16 @@
                         <w:rPr>
                           <w:rFonts w:ascii="Times New Roman" w:hAnsi="Times New Roman" w:cs="Times New Roman"/>
                         </w:rPr>
-                        <w:t xml:space="preserve"> concentration data, and the 2003–2004 cycle.</w:t>
+                        <w:t xml:space="preserve"> concentration data</w:t>
                       </w:r>
+                      <w:del w:id="33" w:author="Nickelberry, Marshae" w:date="2026-02-06T12:42:00Z" w16du:dateUtc="2026-02-06T17:42:00Z">
+                        <w:r>
+                          <w:rPr>
+                            <w:rFonts w:ascii="Times New Roman" w:hAnsi="Times New Roman" w:cs="Times New Roman"/>
+                          </w:rPr>
+                          <w:delText>, and the 2003–2004 cycle.</w:delText>
+                        </w:r>
+                      </w:del>
                       <w:r>
                         <w:rPr>
                           <w:rFonts w:ascii="Times New Roman" w:hAnsi="Times New Roman" w:cs="Times New Roman"/>
@@ -2276,7 +2570,43 @@
           <w:sz w:val="28"/>
           <w:szCs w:val="28"/>
         </w:rPr>
-        <w:t xml:space="preserve">Log Urinary </w:t>
+        <w:t xml:space="preserve">Log </w:t>
+      </w:r>
+      <w:commentRangeStart w:id="17"/>
+      <w:r>
+        <w:rPr>
+          <w:rFonts w:ascii="Times New Roman" w:eastAsiaTheme="majorEastAsia" w:hAnsi="Times New Roman" w:cs="Times New Roman"/>
+          <w:b/>
+          <w:bCs/>
+          <w:color w:val="000000" w:themeColor="text1"/>
+          <w:sz w:val="28"/>
+          <w:szCs w:val="28"/>
+        </w:rPr>
+        <w:t>Urinary</w:t>
+      </w:r>
+      <w:commentRangeEnd w:id="17"/>
+      <w:r>
+        <w:rPr>
+          <w:rStyle w:val="CommentReference"/>
+          <w:rFonts w:ascii="Times New Roman" w:eastAsiaTheme="majorEastAsia" w:hAnsi="Times New Roman" w:cs="Times New Roman"/>
+          <w:b/>
+          <w:bCs/>
+          <w:color w:val="000000" w:themeColor="text1"/>
+          <w:sz w:val="28"/>
+          <w:szCs w:val="28"/>
+        </w:rPr>
+        <w:commentReference w:id="17"/>
+      </w:r>
+      <w:r>
+        <w:rPr>
+          <w:rFonts w:ascii="Times New Roman" w:eastAsiaTheme="majorEastAsia" w:hAnsi="Times New Roman" w:cs="Times New Roman"/>
+          <w:b/>
+          <w:bCs/>
+          <w:color w:val="000000" w:themeColor="text1"/>
+          <w:sz w:val="28"/>
+          <w:szCs w:val="28"/>
+        </w:rPr>
+        <w:t xml:space="preserve"> </w:t>
       </w:r>
       <w:r>
         <w:rPr>
@@ -2336,7 +2666,7 @@
                     <pic:cNvPicPr/>
                   </pic:nvPicPr>
                   <pic:blipFill rotWithShape="1">
-                    <a:blip r:embed="rId8" cstate="print">
+                    <a:blip r:embed="rId12" cstate="print">
                       <a:extLst>
                         <a:ext uri="{28A0092B-C50C-407E-A947-70E740481C1C}">
                           <a14:useLocalDpi xmlns:a14="http://schemas.microsoft.com/office/drawing/2010/main" val="0"/>
@@ -2396,6 +2726,7 @@
           <w:szCs w:val="28"/>
         </w:rPr>
       </w:pPr>
+      <w:commentRangeStart w:id="18"/>
       <w:r>
         <w:rPr>
           <w:rFonts w:ascii="Times New Roman" w:hAnsi="Times New Roman" w:cs="Times New Roman"/>
@@ -2420,6 +2751,19 @@
         </w:rPr>
         <w:t xml:space="preserve"> metabolites and related compounds.</w:t>
       </w:r>
+      <w:commentRangeEnd w:id="18"/>
+      <w:r>
+        <w:rPr>
+          <w:rStyle w:val="CommentReference"/>
+          <w:rFonts w:ascii="Times New Roman" w:eastAsiaTheme="majorEastAsia" w:hAnsi="Times New Roman" w:cs="Times New Roman"/>
+          <w:b/>
+          <w:bCs/>
+          <w:color w:val="000000" w:themeColor="text1"/>
+          <w:sz w:val="28"/>
+          <w:szCs w:val="28"/>
+        </w:rPr>
+        <w:commentReference w:id="18"/>
+      </w:r>
     </w:p>
     <w:p>
       <w:pPr>
@@ -2458,6 +2802,19 @@
           <w:szCs w:val="28"/>
         </w:rPr>
       </w:pPr>
+      <w:ins w:id="19" w:author="Nickelberry, Marshae" w:date="2026-02-06T12:47:00Z" w16du:dateUtc="2026-02-06T17:47:00Z">
+        <w:r>
+          <w:rPr>
+            <w:rFonts w:ascii="Times New Roman" w:hAnsi="Times New Roman" w:cs="Times New Roman"/>
+            <w:b/>
+            <w:bCs/>
+            <w:color w:val="000000" w:themeColor="text1"/>
+            <w:sz w:val="28"/>
+            <w:szCs w:val="28"/>
+          </w:rPr>
+          <w:t xml:space="preserve">Missing additional figures for Race/ethnicity phenols not shown in main analysis </w:t>
+        </w:r>
+      </w:ins>
       <w:r>
         <w:rPr>
           <w:rFonts w:ascii="Times New Roman" w:hAnsi="Times New Roman" w:cs="Times New Roman"/>
@@ -2560,6 +2917,18 @@
           <w:insideV w:val="none" w:sz="0" w:space="0" w:color="auto"/>
         </w:tblBorders>
         <w:tblLook w:val="04A0" w:firstRow="1" w:lastRow="0" w:firstColumn="1" w:lastColumn="0" w:noHBand="0" w:noVBand="1"/>
+        <w:tblPrChange w:id="20" w:author="Nickelberry, Marshae" w:date="2026-02-06T12:44:00Z" w16du:dateUtc="2026-02-06T17:44:00Z">
+          <w:tblPr>
+            <w:tblStyle w:val="TableGrid"/>
+            <w:tblW w:w="11246" w:type="dxa"/>
+            <w:tblInd w:w="-113" w:type="dxa"/>
+            <w:tblBorders>
+              <w:insideH w:val="none" w:sz="0" w:space="0" w:color="auto"/>
+              <w:insideV w:val="none" w:sz="0" w:space="0" w:color="auto"/>
+            </w:tblBorders>
+            <w:tblLook w:val="04A0" w:firstRow="1" w:lastRow="0" w:firstColumn="1" w:lastColumn="0" w:noHBand="0" w:noVBand="1"/>
+          </w:tblPr>
+        </w:tblPrChange>
       </w:tblPr>
       <w:tblGrid>
         <w:gridCol w:w="1955"/>
@@ -2569,15 +2938,48 @@
         <w:gridCol w:w="1274"/>
         <w:gridCol w:w="1058"/>
         <w:gridCol w:w="1274"/>
+        <w:tblGridChange w:id="21">
+          <w:tblGrid>
+            <w:gridCol w:w="113"/>
+            <w:gridCol w:w="1842"/>
+            <w:gridCol w:w="113"/>
+            <w:gridCol w:w="1842"/>
+            <w:gridCol w:w="113"/>
+            <w:gridCol w:w="1851"/>
+            <w:gridCol w:w="113"/>
+            <w:gridCol w:w="1653"/>
+            <w:gridCol w:w="113"/>
+            <w:gridCol w:w="1161"/>
+            <w:gridCol w:w="113"/>
+            <w:gridCol w:w="945"/>
+            <w:gridCol w:w="113"/>
+            <w:gridCol w:w="1161"/>
+            <w:gridCol w:w="113"/>
+          </w:tblGrid>
+        </w:tblGridChange>
       </w:tblGrid>
       <w:tr>
         <w:trPr>
           <w:trHeight w:val="369"/>
+          <w:trPrChange w:id="22" w:author="Nickelberry, Marshae" w:date="2026-02-06T12:44:00Z" w16du:dateUtc="2026-02-06T17:44:00Z">
+            <w:trPr>
+              <w:gridBefore w:val="1"/>
+              <w:trHeight w:val="369"/>
+            </w:trPr>
+          </w:trPrChange>
         </w:trPr>
         <w:tc>
           <w:tcPr>
             <w:tcW w:w="1955" w:type="dxa"/>
             <w:shd w:val="clear" w:color="auto" w:fill="000000" w:themeFill="text1"/>
+            <w:vAlign w:val="center"/>
+            <w:tcPrChange w:id="23" w:author="Nickelberry, Marshae" w:date="2026-02-06T12:44:00Z" w16du:dateUtc="2026-02-06T17:44:00Z">
+              <w:tcPr>
+                <w:tcW w:w="1955" w:type="dxa"/>
+                <w:gridSpan w:val="2"/>
+                <w:shd w:val="clear" w:color="auto" w:fill="000000" w:themeFill="text1"/>
+              </w:tcPr>
+            </w:tcPrChange>
           </w:tcPr>
           <w:p>
             <w:pPr>
@@ -2630,7 +3032,7 @@
                 <w:sz w:val="22"/>
                 <w:szCs w:val="22"/>
               </w:rPr>
-              <w:t xml:space="preserve"> Phenol Metabolite</w:t>
+              <w:t>Phenol Metabolite</w:t>
             </w:r>
             <w:r>
               <w:rPr>
@@ -2651,28 +3053,51 @@
             <w:shd w:val="clear" w:color="auto" w:fill="000000" w:themeFill="text1"/>
             <w:vAlign w:val="center"/>
             <w:hideMark/>
-          </w:tcPr>
-          <w:p>
-            <w:pPr>
-              <w:jc w:val="center"/>
-              <w:rPr>
-                <w:rFonts w:ascii="Times New Roman" w:hAnsi="Times New Roman" w:cs="Times New Roman"/>
-                <w:b/>
-                <w:bCs/>
-                <w:sz w:val="22"/>
-                <w:szCs w:val="22"/>
-              </w:rPr>
-            </w:pPr>
-            <w:r>
-              <w:rPr>
-                <w:rFonts w:ascii="Times New Roman" w:hAnsi="Times New Roman" w:cs="Times New Roman"/>
-                <w:b/>
-                <w:bCs/>
-                <w:sz w:val="22"/>
-                <w:szCs w:val="22"/>
-              </w:rPr>
-              <w:t>Term</w:t>
-            </w:r>
+            <w:tcPrChange w:id="24" w:author="Nickelberry, Marshae" w:date="2026-02-06T12:44:00Z" w16du:dateUtc="2026-02-06T17:44:00Z">
+              <w:tcPr>
+                <w:tcW w:w="1955" w:type="dxa"/>
+                <w:gridSpan w:val="2"/>
+                <w:shd w:val="clear" w:color="auto" w:fill="000000" w:themeFill="text1"/>
+                <w:vAlign w:val="center"/>
+                <w:hideMark/>
+              </w:tcPr>
+            </w:tcPrChange>
+          </w:tcPr>
+          <w:p>
+            <w:pPr>
+              <w:jc w:val="center"/>
+              <w:rPr>
+                <w:rFonts w:ascii="Times New Roman" w:hAnsi="Times New Roman" w:cs="Times New Roman"/>
+                <w:b/>
+                <w:bCs/>
+                <w:sz w:val="22"/>
+                <w:szCs w:val="22"/>
+              </w:rPr>
+            </w:pPr>
+            <w:del w:id="25" w:author="Nickelberry, Marshae" w:date="2026-02-06T12:44:00Z" w16du:dateUtc="2026-02-06T17:44:00Z">
+              <w:r>
+                <w:rPr>
+                  <w:rFonts w:ascii="Times New Roman" w:hAnsi="Times New Roman" w:cs="Times New Roman"/>
+                  <w:b/>
+                  <w:bCs/>
+                  <w:sz w:val="22"/>
+                  <w:szCs w:val="22"/>
+                </w:rPr>
+                <w:delText>Term</w:delText>
+              </w:r>
+            </w:del>
+            <w:ins w:id="26" w:author="Nickelberry, Marshae" w:date="2026-02-06T12:44:00Z" w16du:dateUtc="2026-02-06T17:44:00Z">
+              <w:r>
+                <w:rPr>
+                  <w:rFonts w:ascii="Times New Roman" w:hAnsi="Times New Roman" w:cs="Times New Roman"/>
+                  <w:b/>
+                  <w:bCs/>
+                  <w:sz w:val="22"/>
+                  <w:szCs w:val="22"/>
+                </w:rPr>
+                <w:t>Food Security</w:t>
+              </w:r>
+            </w:ins>
           </w:p>
         </w:tc>
         <w:tc>
@@ -2681,18 +3106,28 @@
             <w:shd w:val="clear" w:color="auto" w:fill="000000" w:themeFill="text1"/>
             <w:vAlign w:val="center"/>
             <w:hideMark/>
-          </w:tcPr>
-          <w:p>
-            <w:pPr>
-              <w:jc w:val="center"/>
-              <w:rPr>
-                <w:rFonts w:ascii="Times New Roman" w:hAnsi="Times New Roman" w:cs="Times New Roman"/>
-                <w:b/>
-                <w:bCs/>
-                <w:sz w:val="22"/>
-                <w:szCs w:val="22"/>
-              </w:rPr>
-            </w:pPr>
+            <w:tcPrChange w:id="27" w:author="Nickelberry, Marshae" w:date="2026-02-06T12:44:00Z" w16du:dateUtc="2026-02-06T17:44:00Z">
+              <w:tcPr>
+                <w:tcW w:w="1964" w:type="dxa"/>
+                <w:gridSpan w:val="2"/>
+                <w:shd w:val="clear" w:color="auto" w:fill="000000" w:themeFill="text1"/>
+                <w:vAlign w:val="center"/>
+                <w:hideMark/>
+              </w:tcPr>
+            </w:tcPrChange>
+          </w:tcPr>
+          <w:p>
+            <w:pPr>
+              <w:jc w:val="center"/>
+              <w:rPr>
+                <w:rFonts w:ascii="Times New Roman" w:hAnsi="Times New Roman" w:cs="Times New Roman"/>
+                <w:b/>
+                <w:bCs/>
+                <w:sz w:val="22"/>
+                <w:szCs w:val="22"/>
+              </w:rPr>
+            </w:pPr>
+            <w:commentRangeStart w:id="28"/>
             <w:r>
               <w:rPr>
                 <w:rFonts w:ascii="Times New Roman" w:hAnsi="Times New Roman" w:cs="Times New Roman"/>
@@ -2703,6 +3138,30 @@
               </w:rPr>
               <w:t>Food Security Level</w:t>
             </w:r>
+            <w:commentRangeEnd w:id="28"/>
+            <w:r>
+              <w:rPr>
+                <w:rStyle w:val="CommentReference"/>
+                <w:rFonts w:ascii="Times New Roman" w:hAnsi="Times New Roman" w:cs="Times New Roman"/>
+                <w:b/>
+                <w:bCs/>
+                <w:sz w:val="22"/>
+                <w:szCs w:val="22"/>
+              </w:rPr>
+              <w:commentReference w:id="28"/>
+            </w:r>
+            <w:ins w:id="29" w:author="Nickelberry, Marshae" w:date="2026-02-06T12:45:00Z" w16du:dateUtc="2026-02-06T17:45:00Z">
+              <w:r>
+                <w:rPr>
+                  <w:rFonts w:ascii="Times New Roman" w:hAnsi="Times New Roman" w:cs="Times New Roman"/>
+                  <w:b/>
+                  <w:bCs/>
+                  <w:sz w:val="22"/>
+                  <w:szCs w:val="22"/>
+                </w:rPr>
+                <w:t xml:space="preserve">This </w:t>
+              </w:r>
+            </w:ins>
           </w:p>
         </w:tc>
         <w:tc>
@@ -2711,6 +3170,15 @@
             <w:shd w:val="clear" w:color="auto" w:fill="000000" w:themeFill="text1"/>
             <w:vAlign w:val="center"/>
             <w:hideMark/>
+            <w:tcPrChange w:id="30" w:author="Nickelberry, Marshae" w:date="2026-02-06T12:44:00Z" w16du:dateUtc="2026-02-06T17:44:00Z">
+              <w:tcPr>
+                <w:tcW w:w="1766" w:type="dxa"/>
+                <w:gridSpan w:val="2"/>
+                <w:shd w:val="clear" w:color="auto" w:fill="000000" w:themeFill="text1"/>
+                <w:vAlign w:val="center"/>
+                <w:hideMark/>
+              </w:tcPr>
+            </w:tcPrChange>
           </w:tcPr>
           <w:p>
             <w:pPr>
@@ -2742,6 +3210,15 @@
             <w:shd w:val="clear" w:color="auto" w:fill="000000" w:themeFill="text1"/>
             <w:vAlign w:val="center"/>
             <w:hideMark/>
+            <w:tcPrChange w:id="31" w:author="Nickelberry, Marshae" w:date="2026-02-06T12:44:00Z" w16du:dateUtc="2026-02-06T17:44:00Z">
+              <w:tcPr>
+                <w:tcW w:w="2332" w:type="dxa"/>
+                <w:gridSpan w:val="4"/>
+                <w:shd w:val="clear" w:color="auto" w:fill="000000" w:themeFill="text1"/>
+                <w:vAlign w:val="center"/>
+                <w:hideMark/>
+              </w:tcPr>
+            </w:tcPrChange>
           </w:tcPr>
           <w:p>
             <w:pPr>
@@ -2772,6 +3249,15 @@
             <w:shd w:val="clear" w:color="auto" w:fill="000000" w:themeFill="text1"/>
             <w:vAlign w:val="center"/>
             <w:hideMark/>
+            <w:tcPrChange w:id="32" w:author="Nickelberry, Marshae" w:date="2026-02-06T12:44:00Z" w16du:dateUtc="2026-02-06T17:44:00Z">
+              <w:tcPr>
+                <w:tcW w:w="1274" w:type="dxa"/>
+                <w:gridSpan w:val="2"/>
+                <w:shd w:val="clear" w:color="auto" w:fill="000000" w:themeFill="text1"/>
+                <w:vAlign w:val="center"/>
+                <w:hideMark/>
+              </w:tcPr>
+            </w:tcPrChange>
           </w:tcPr>
           <w:p>
             <w:pPr>
@@ -2800,38 +3286,155 @@
       <w:tr>
         <w:trPr>
           <w:trHeight w:val="340"/>
+          <w:trPrChange w:id="33" w:author="Nickelberry, Marshae" w:date="2026-02-06T12:45:00Z" w16du:dateUtc="2026-02-06T17:45:00Z">
+            <w:trPr>
+              <w:gridBefore w:val="1"/>
+              <w:trHeight w:val="340"/>
+            </w:trPr>
+          </w:trPrChange>
         </w:trPr>
-        <w:tc>
-          <w:tcPr>
-            <w:tcW w:w="1955" w:type="dxa"/>
-          </w:tcPr>
-          <w:p>
-            <w:pPr>
-              <w:jc w:val="center"/>
-              <w:rPr>
-                <w:rFonts w:ascii="Times New Roman" w:hAnsi="Times New Roman" w:cs="Times New Roman"/>
-                <w:sz w:val="22"/>
-                <w:szCs w:val="22"/>
-              </w:rPr>
-            </w:pPr>
-            <w:r>
-              <w:rPr>
-                <w:rFonts w:ascii="Times New Roman" w:hAnsi="Times New Roman" w:cs="Times New Roman"/>
-                <w:color w:val="000000"/>
-                <w:sz w:val="22"/>
-                <w:szCs w:val="22"/>
-              </w:rPr>
-              <w:t>BPA</w:t>
-            </w:r>
-          </w:p>
-        </w:tc>
         <w:tc>
           <w:tcPr>
             <w:tcW w:w="1955" w:type="dxa"/>
             <w:vMerge w:val="restart"/>
-            <w:noWrap/>
             <w:vAlign w:val="center"/>
-            <w:hideMark/>
+            <w:tcPrChange w:id="34" w:author="Nickelberry, Marshae" w:date="2026-02-06T12:45:00Z" w16du:dateUtc="2026-02-06T17:45:00Z">
+              <w:tcPr>
+                <w:tcW w:w="1955" w:type="dxa"/>
+                <w:gridSpan w:val="2"/>
+                <w:vMerge w:val="restart"/>
+              </w:tcPr>
+            </w:tcPrChange>
+          </w:tcPr>
+          <w:p>
+            <w:pPr>
+              <w:jc w:val="center"/>
+              <w:rPr>
+                <w:del w:id="35" w:author="Nickelberry, Marshae" w:date="2026-02-06T12:45:00Z" w16du:dateUtc="2026-02-06T17:45:00Z"/>
+                <w:rFonts w:ascii="Times New Roman" w:hAnsi="Times New Roman" w:cs="Times New Roman"/>
+                <w:sz w:val="22"/>
+                <w:szCs w:val="22"/>
+              </w:rPr>
+            </w:pPr>
+            <w:commentRangeStart w:id="36"/>
+            <w:del w:id="37" w:author="Nickelberry, Marshae" w:date="2026-02-06T12:45:00Z" w16du:dateUtc="2026-02-06T17:45:00Z">
+              <w:r>
+                <w:rPr>
+                  <w:rFonts w:ascii="Times New Roman" w:hAnsi="Times New Roman" w:cs="Times New Roman"/>
+                  <w:color w:val="000000"/>
+                  <w:sz w:val="22"/>
+                  <w:szCs w:val="22"/>
+                </w:rPr>
+                <w:delText>BPA</w:delText>
+              </w:r>
+            </w:del>
+          </w:p>
+          <w:p>
+            <w:pPr>
+              <w:jc w:val="center"/>
+              <w:rPr>
+                <w:del w:id="38" w:author="Nickelberry, Marshae" w:date="2026-02-06T12:45:00Z" w16du:dateUtc="2026-02-06T17:45:00Z"/>
+                <w:rFonts w:ascii="Times New Roman" w:hAnsi="Times New Roman" w:cs="Times New Roman"/>
+                <w:sz w:val="22"/>
+                <w:szCs w:val="22"/>
+              </w:rPr>
+            </w:pPr>
+            <w:del w:id="39" w:author="Nickelberry, Marshae" w:date="2026-02-06T12:45:00Z" w16du:dateUtc="2026-02-06T17:45:00Z">
+              <w:r>
+                <w:rPr>
+                  <w:rFonts w:ascii="Times New Roman" w:hAnsi="Times New Roman" w:cs="Times New Roman"/>
+                  <w:color w:val="000000"/>
+                  <w:sz w:val="22"/>
+                  <w:szCs w:val="22"/>
+                </w:rPr>
+                <w:delText>BPA</w:delText>
+              </w:r>
+            </w:del>
+          </w:p>
+          <w:p>
+            <w:pPr>
+              <w:jc w:val="center"/>
+              <w:rPr>
+                <w:del w:id="40" w:author="Nickelberry, Marshae" w:date="2026-02-06T12:45:00Z" w16du:dateUtc="2026-02-06T17:45:00Z"/>
+                <w:rFonts w:ascii="Times New Roman" w:hAnsi="Times New Roman" w:cs="Times New Roman"/>
+                <w:b/>
+                <w:bCs/>
+                <w:sz w:val="22"/>
+                <w:szCs w:val="22"/>
+              </w:rPr>
+            </w:pPr>
+            <w:del w:id="41" w:author="Nickelberry, Marshae" w:date="2026-02-06T12:45:00Z" w16du:dateUtc="2026-02-06T17:45:00Z">
+              <w:r>
+                <w:rPr>
+                  <w:rFonts w:ascii="Times New Roman" w:hAnsi="Times New Roman" w:cs="Times New Roman"/>
+                  <w:color w:val="000000"/>
+                  <w:sz w:val="22"/>
+                  <w:szCs w:val="22"/>
+                </w:rPr>
+                <w:delText>BPA</w:delText>
+              </w:r>
+            </w:del>
+          </w:p>
+          <w:p>
+            <w:pPr>
+              <w:jc w:val="center"/>
+              <w:rPr>
+                <w:rFonts w:ascii="Times New Roman" w:hAnsi="Times New Roman" w:cs="Times New Roman"/>
+                <w:sz w:val="22"/>
+                <w:szCs w:val="22"/>
+              </w:rPr>
+            </w:pPr>
+            <w:del w:id="42" w:author="Nickelberry, Marshae" w:date="2026-02-06T12:45:00Z" w16du:dateUtc="2026-02-06T17:45:00Z">
+              <w:r>
+                <w:rPr>
+                  <w:rFonts w:ascii="Times New Roman" w:hAnsi="Times New Roman" w:cs="Times New Roman"/>
+                  <w:color w:val="000000"/>
+                  <w:sz w:val="22"/>
+                  <w:szCs w:val="22"/>
+                </w:rPr>
+                <w:delText>BPA</w:delText>
+              </w:r>
+            </w:del>
+            <w:ins w:id="43" w:author="Nickelberry, Marshae" w:date="2026-02-06T12:45:00Z" w16du:dateUtc="2026-02-06T17:45:00Z">
+              <w:r>
+                <w:rPr>
+                  <w:rFonts w:ascii="Times New Roman" w:hAnsi="Times New Roman" w:cs="Times New Roman"/>
+                  <w:color w:val="000000"/>
+                  <w:sz w:val="22"/>
+                  <w:szCs w:val="22"/>
+                </w:rPr>
+                <w:t>BPA</w:t>
+              </w:r>
+            </w:ins>
+            <w:commentRangeEnd w:id="36"/>
+            <w:r>
+              <w:rPr>
+                <w:rStyle w:val="CommentReference"/>
+                <w:rFonts w:ascii="Times New Roman" w:hAnsi="Times New Roman" w:cs="Times New Roman"/>
+                <w:sz w:val="22"/>
+                <w:szCs w:val="22"/>
+              </w:rPr>
+              <w:commentReference w:id="36"/>
+            </w:r>
+          </w:p>
+        </w:tc>
+        <w:tc>
+          <w:tcPr>
+            <w:tcW w:w="1955" w:type="dxa"/>
+            <w:vMerge w:val="restart"/>
+            <w:noWrap/>
+            <w:vAlign w:val="center"/>
+            <w:hideMark/>
+            <w:tcPrChange w:id="44" w:author="Nickelberry, Marshae" w:date="2026-02-06T12:45:00Z" w16du:dateUtc="2026-02-06T17:45:00Z">
+              <w:tcPr>
+                <w:tcW w:w="1955" w:type="dxa"/>
+                <w:gridSpan w:val="2"/>
+                <w:vMerge w:val="restart"/>
+                <w:noWrap/>
+                <w:vAlign w:val="center"/>
+                <w:hideMark/>
+              </w:tcPr>
+            </w:tcPrChange>
           </w:tcPr>
           <w:p>
             <w:pPr>
@@ -2920,6 +3523,15 @@
             <w:noWrap/>
             <w:vAlign w:val="center"/>
             <w:hideMark/>
+            <w:tcPrChange w:id="45" w:author="Nickelberry, Marshae" w:date="2026-02-06T12:45:00Z" w16du:dateUtc="2026-02-06T17:45:00Z">
+              <w:tcPr>
+                <w:tcW w:w="1964" w:type="dxa"/>
+                <w:gridSpan w:val="2"/>
+                <w:noWrap/>
+                <w:vAlign w:val="center"/>
+                <w:hideMark/>
+              </w:tcPr>
+            </w:tcPrChange>
           </w:tcPr>
           <w:p>
             <w:pPr>
@@ -2945,6 +3557,14 @@
             <w:tcW w:w="1766" w:type="dxa"/>
             <w:noWrap/>
             <w:vAlign w:val="bottom"/>
+            <w:tcPrChange w:id="46" w:author="Nickelberry, Marshae" w:date="2026-02-06T12:45:00Z" w16du:dateUtc="2026-02-06T17:45:00Z">
+              <w:tcPr>
+                <w:tcW w:w="1766" w:type="dxa"/>
+                <w:gridSpan w:val="2"/>
+                <w:noWrap/>
+                <w:vAlign w:val="bottom"/>
+              </w:tcPr>
+            </w:tcPrChange>
           </w:tcPr>
           <w:p>
             <w:pPr>
@@ -2962,6 +3582,14 @@
             <w:tcW w:w="1274" w:type="dxa"/>
             <w:noWrap/>
             <w:vAlign w:val="bottom"/>
+            <w:tcPrChange w:id="47" w:author="Nickelberry, Marshae" w:date="2026-02-06T12:45:00Z" w16du:dateUtc="2026-02-06T17:45:00Z">
+              <w:tcPr>
+                <w:tcW w:w="1274" w:type="dxa"/>
+                <w:gridSpan w:val="2"/>
+                <w:noWrap/>
+                <w:vAlign w:val="bottom"/>
+              </w:tcPr>
+            </w:tcPrChange>
           </w:tcPr>
           <w:p>
             <w:pPr>
@@ -2979,6 +3607,14 @@
             <w:tcW w:w="1058" w:type="dxa"/>
             <w:noWrap/>
             <w:vAlign w:val="bottom"/>
+            <w:tcPrChange w:id="48" w:author="Nickelberry, Marshae" w:date="2026-02-06T12:45:00Z" w16du:dateUtc="2026-02-06T17:45:00Z">
+              <w:tcPr>
+                <w:tcW w:w="1058" w:type="dxa"/>
+                <w:gridSpan w:val="2"/>
+                <w:noWrap/>
+                <w:vAlign w:val="bottom"/>
+              </w:tcPr>
+            </w:tcPrChange>
           </w:tcPr>
           <w:p>
             <w:pPr>
@@ -2996,6 +3632,14 @@
             <w:tcW w:w="1274" w:type="dxa"/>
             <w:noWrap/>
             <w:vAlign w:val="bottom"/>
+            <w:tcPrChange w:id="49" w:author="Nickelberry, Marshae" w:date="2026-02-06T12:45:00Z" w16du:dateUtc="2026-02-06T17:45:00Z">
+              <w:tcPr>
+                <w:tcW w:w="1274" w:type="dxa"/>
+                <w:gridSpan w:val="2"/>
+                <w:noWrap/>
+                <w:vAlign w:val="bottom"/>
+              </w:tcPr>
+            </w:tcPrChange>
           </w:tcPr>
           <w:p>
             <w:pPr>
@@ -3016,25 +3660,17 @@
         <w:tc>
           <w:tcPr>
             <w:tcW w:w="1955" w:type="dxa"/>
-          </w:tcPr>
-          <w:p>
-            <w:pPr>
-              <w:jc w:val="center"/>
-              <w:rPr>
-                <w:rFonts w:ascii="Times New Roman" w:hAnsi="Times New Roman" w:cs="Times New Roman"/>
-                <w:sz w:val="22"/>
-                <w:szCs w:val="22"/>
-              </w:rPr>
-            </w:pPr>
-            <w:r>
-              <w:rPr>
-                <w:rFonts w:ascii="Times New Roman" w:hAnsi="Times New Roman" w:cs="Times New Roman"/>
-                <w:color w:val="000000"/>
-                <w:sz w:val="22"/>
-                <w:szCs w:val="22"/>
-              </w:rPr>
-              <w:t>BPA</w:t>
-            </w:r>
+            <w:vMerge/>
+          </w:tcPr>
+          <w:p>
+            <w:pPr>
+              <w:jc w:val="center"/>
+              <w:rPr>
+                <w:rFonts w:ascii="Times New Roman" w:hAnsi="Times New Roman" w:cs="Times New Roman"/>
+                <w:sz w:val="22"/>
+                <w:szCs w:val="22"/>
+              </w:rPr>
+            </w:pPr>
           </w:p>
         </w:tc>
         <w:tc>
@@ -3200,27 +3836,19 @@
         <w:tc>
           <w:tcPr>
             <w:tcW w:w="1955" w:type="dxa"/>
-          </w:tcPr>
-          <w:p>
-            <w:pPr>
-              <w:jc w:val="center"/>
-              <w:rPr>
-                <w:rFonts w:ascii="Times New Roman" w:hAnsi="Times New Roman" w:cs="Times New Roman"/>
-                <w:b/>
-                <w:bCs/>
-                <w:sz w:val="22"/>
-                <w:szCs w:val="22"/>
-              </w:rPr>
-            </w:pPr>
-            <w:r>
-              <w:rPr>
-                <w:rFonts w:ascii="Times New Roman" w:hAnsi="Times New Roman" w:cs="Times New Roman"/>
-                <w:color w:val="000000"/>
-                <w:sz w:val="22"/>
-                <w:szCs w:val="22"/>
-              </w:rPr>
-              <w:t>BPA</w:t>
-            </w:r>
+            <w:vMerge/>
+          </w:tcPr>
+          <w:p>
+            <w:pPr>
+              <w:jc w:val="center"/>
+              <w:rPr>
+                <w:rFonts w:ascii="Times New Roman" w:hAnsi="Times New Roman" w:cs="Times New Roman"/>
+                <w:b/>
+                <w:bCs/>
+                <w:sz w:val="22"/>
+                <w:szCs w:val="22"/>
+              </w:rPr>
+            </w:pPr>
           </w:p>
         </w:tc>
         <w:tc>
@@ -3388,27 +4016,19 @@
         <w:tc>
           <w:tcPr>
             <w:tcW w:w="1955" w:type="dxa"/>
-          </w:tcPr>
-          <w:p>
-            <w:pPr>
-              <w:jc w:val="center"/>
-              <w:rPr>
-                <w:rFonts w:ascii="Times New Roman" w:hAnsi="Times New Roman" w:cs="Times New Roman"/>
-                <w:b/>
-                <w:bCs/>
-                <w:sz w:val="22"/>
-                <w:szCs w:val="22"/>
-              </w:rPr>
-            </w:pPr>
-            <w:r>
-              <w:rPr>
-                <w:rFonts w:ascii="Times New Roman" w:hAnsi="Times New Roman" w:cs="Times New Roman"/>
-                <w:color w:val="000000"/>
-                <w:sz w:val="22"/>
-                <w:szCs w:val="22"/>
-              </w:rPr>
-              <w:t>BPA</w:t>
-            </w:r>
+            <w:vMerge/>
+          </w:tcPr>
+          <w:p>
+            <w:pPr>
+              <w:jc w:val="center"/>
+              <w:rPr>
+                <w:rFonts w:ascii="Times New Roman" w:hAnsi="Times New Roman" w:cs="Times New Roman"/>
+                <w:b/>
+                <w:bCs/>
+                <w:sz w:val="22"/>
+                <w:szCs w:val="22"/>
+              </w:rPr>
+            </w:pPr>
           </w:p>
         </w:tc>
         <w:tc>
@@ -3611,13 +4231,42 @@
                 <w:szCs w:val="22"/>
               </w:rPr>
             </w:pPr>
-            <w:r>
-              <w:rPr>
-                <w:rFonts w:ascii="Times New Roman" w:hAnsi="Times New Roman" w:cs="Times New Roman"/>
-                <w:sz w:val="22"/>
-                <w:szCs w:val="22"/>
-              </w:rPr>
-              <w:t>Intercept (Ref)</w:t>
+            <w:commentRangeStart w:id="50"/>
+            <w:r>
+              <w:rPr>
+                <w:rFonts w:ascii="Times New Roman" w:hAnsi="Times New Roman" w:cs="Times New Roman"/>
+                <w:sz w:val="22"/>
+                <w:szCs w:val="22"/>
+              </w:rPr>
+              <w:t xml:space="preserve">Intercept </w:t>
+            </w:r>
+            <w:commentRangeEnd w:id="50"/>
+            <w:r>
+              <w:rPr>
+                <w:rStyle w:val="CommentReference"/>
+                <w:rFonts w:ascii="Times New Roman" w:hAnsi="Times New Roman" w:cs="Times New Roman"/>
+                <w:sz w:val="22"/>
+                <w:szCs w:val="22"/>
+              </w:rPr>
+              <w:commentReference w:id="50"/>
+            </w:r>
+            <w:ins w:id="51" w:author="Nickelberry, Marshae" w:date="2026-02-06T12:43:00Z" w16du:dateUtc="2026-02-06T17:43:00Z">
+              <w:r>
+                <w:rPr>
+                  <w:rFonts w:ascii="Times New Roman" w:hAnsi="Times New Roman" w:cs="Times New Roman"/>
+                  <w:sz w:val="22"/>
+                  <w:szCs w:val="22"/>
+                </w:rPr>
+                <w:t>In</w:t>
+              </w:r>
+            </w:ins>
+            <w:r>
+              <w:rPr>
+                <w:rFonts w:ascii="Times New Roman" w:hAnsi="Times New Roman" w:cs="Times New Roman"/>
+                <w:sz w:val="22"/>
+                <w:szCs w:val="22"/>
+              </w:rPr>
+              <w:t>(Ref)</w:t>
             </w:r>
           </w:p>
           <w:p>
@@ -3691,6 +4340,7 @@
                 <w:szCs w:val="22"/>
               </w:rPr>
             </w:pPr>
+            <w:commentRangeStart w:id="52"/>
             <w:r>
               <w:rPr>
                 <w:rFonts w:ascii="Times New Roman" w:hAnsi="Times New Roman" w:cs="Times New Roman"/>
@@ -3701,6 +4351,7 @@
             </w:r>
           </w:p>
         </w:tc>
+        <w:commentRangeEnd w:id="52"/>
         <w:tc>
           <w:tcPr>
             <w:tcW w:w="1766" w:type="dxa"/>
@@ -3716,6 +4367,15 @@
                 <w:szCs w:val="22"/>
               </w:rPr>
             </w:pPr>
+            <w:r>
+              <w:rPr>
+                <w:rStyle w:val="CommentReference"/>
+                <w:rFonts w:ascii="Times New Roman" w:hAnsi="Times New Roman" w:cs="Times New Roman"/>
+                <w:sz w:val="22"/>
+                <w:szCs w:val="22"/>
+              </w:rPr>
+              <w:commentReference w:id="52"/>
+            </w:r>
           </w:p>
         </w:tc>
         <w:tc>
@@ -7542,7 +8202,7 @@
         </w:rPr>
         <w:t xml:space="preserve"> 95% CI= 95% confidence interval. </w:t>
       </w:r>
-      <w:bookmarkStart w:id="0" w:name="_Hlk208244463"/>
+      <w:bookmarkStart w:id="53" w:name="_Hlk208244463"/>
     </w:p>
     <w:p>
       <w:pPr>
@@ -7735,8 +8395,18 @@
                 <w:b/>
                 <w:bCs/>
               </w:rPr>
-              <w:t>% Difference (Interaction)</w:t>
-            </w:r>
+              <w:t xml:space="preserve">% Difference </w:t>
+            </w:r>
+            <w:del w:id="54" w:author="Nickelberry, Marshae" w:date="2026-02-06T12:45:00Z" w16du:dateUtc="2026-02-06T17:45:00Z">
+              <w:r>
+                <w:rPr>
+                  <w:rFonts w:ascii="Times New Roman" w:hAnsi="Times New Roman" w:cs="Times New Roman"/>
+                  <w:b/>
+                  <w:bCs/>
+                </w:rPr>
+                <w:delText>(Interaction)</w:delText>
+              </w:r>
+            </w:del>
           </w:p>
         </w:tc>
         <w:tc>
@@ -8611,6 +9281,7 @@
                 <w:color w:val="000000" w:themeColor="text1"/>
               </w:rPr>
             </w:pPr>
+            <w:commentRangeStart w:id="55"/>
             <w:r>
               <w:rPr>
                 <w:rFonts w:ascii="Helvetica Neue" w:hAnsi="Helvetica Neue"/>
@@ -8667,6 +9338,17 @@
                 <w:szCs w:val="15"/>
               </w:rPr>
               <w:t>28.41</w:t>
+            </w:r>
+            <w:commentRangeEnd w:id="55"/>
+            <w:r>
+              <w:rPr>
+                <w:rStyle w:val="CommentReference"/>
+                <w:rFonts w:ascii="Times New Roman" w:hAnsi="Times New Roman" w:cs="Times New Roman"/>
+                <w:color w:val="000000"/>
+                <w:sz w:val="24"/>
+                <w:szCs w:val="24"/>
+              </w:rPr>
+              <w:commentReference w:id="55"/>
             </w:r>
           </w:p>
         </w:tc>
@@ -15728,6 +16410,7 @@
                 <w:szCs w:val="22"/>
               </w:rPr>
             </w:pPr>
+            <w:commentRangeStart w:id="56"/>
             <w:r>
               <w:rPr>
                 <w:rFonts w:ascii="Times New Roman" w:hAnsi="Times New Roman" w:cs="Times New Roman"/>
@@ -15736,6 +16419,17 @@
                 <w:szCs w:val="22"/>
               </w:rPr>
               <w:t>0.72</w:t>
+            </w:r>
+            <w:commentRangeEnd w:id="56"/>
+            <w:r>
+              <w:rPr>
+                <w:rStyle w:val="CommentReference"/>
+                <w:rFonts w:ascii="Times New Roman" w:hAnsi="Times New Roman" w:cs="Times New Roman"/>
+                <w:color w:val="000000" w:themeColor="text1"/>
+                <w:sz w:val="22"/>
+                <w:szCs w:val="22"/>
+              </w:rPr>
+              <w:commentReference w:id="56"/>
             </w:r>
           </w:p>
         </w:tc>
@@ -19010,7 +19704,7 @@
         </w:rPr>
         <w:t>interval</w:t>
       </w:r>
-      <w:bookmarkEnd w:id="0"/>
+      <w:bookmarkEnd w:id="53"/>
     </w:p>
     <w:p>
       <w:pPr>
@@ -42302,7 +42996,7 @@
       </w:pPr>
     </w:p>
     <w:sectPr>
-      <w:headerReference w:type="default" r:id="rId9"/>
+      <w:headerReference w:type="default" r:id="rId13"/>
       <w:pgSz w:w="12240" w:h="15840" w:code="1"/>
       <w:pgMar w:top="720" w:right="720" w:bottom="720" w:left="720" w:header="720" w:footer="720" w:gutter="0"/>
       <w:cols w:space="720"/>
@@ -42310,6 +43004,186 @@
     </w:sectPr>
   </w:body>
 </w:document>
+</file>
+
+<file path=word/comments.xml><?xml version="1.0" encoding="utf-8"?>
+<w:comments xmlns:wpc="http://schemas.microsoft.com/office/word/2010/wordprocessingCanvas" xmlns:cx="http://schemas.microsoft.com/office/drawing/2014/chartex" xmlns:cx1="http://schemas.microsoft.com/office/drawing/2015/9/8/chartex" xmlns:cx2="http://schemas.microsoft.com/office/drawing/2015/10/21/chartex" xmlns:cx3="http://schemas.microsoft.com/office/drawing/2016/5/9/chartex" xmlns:cx4="http://schemas.microsoft.com/office/drawing/2016/5/10/chartex" xmlns:cx5="http://schemas.microsoft.com/office/drawing/2016/5/11/chartex" xmlns:cx6="http://schemas.microsoft.com/office/drawing/2016/5/12/chartex" xmlns:cx7="http://schemas.microsoft.com/office/drawing/2016/5/13/chartex" xmlns:cx8="http://schemas.microsoft.com/office/drawing/2016/5/14/chartex" xmlns:mc="http://schemas.openxmlformats.org/markup-compatibility/2006" xmlns:aink="http://schemas.microsoft.com/office/drawing/2016/ink" xmlns:am3d="http://schemas.microsoft.com/office/drawing/2017/model3d" xmlns:o="urn:schemas-microsoft-com:office:office" xmlns:oel="http://schemas.microsoft.com/office/2019/extlst" xmlns:r="http://schemas.openxmlformats.org/officeDocument/2006/relationships" xmlns:m="http://schemas.openxmlformats.org/officeDocument/2006/math" xmlns:v="urn:schemas-microsoft-com:vml" xmlns:wp14="http://schemas.microsoft.com/office/word/2010/wordprocessingDrawing" xmlns:wp="http://schemas.openxmlformats.org/drawingml/2006/wordprocessingDrawing" xmlns:w10="urn:schemas-microsoft-com:office:word" xmlns:w="http://schemas.openxmlformats.org/wordprocessingml/2006/main" xmlns:w14="http://schemas.microsoft.com/office/word/2010/wordml" xmlns:w15="http://schemas.microsoft.com/office/word/2012/wordml" xmlns:w16cex="http://schemas.microsoft.com/office/word/2018/wordml/cex" xmlns:w16cid="http://schemas.microsoft.com/office/word/2016/wordml/cid" xmlns:w16="http://schemas.microsoft.com/office/word/2018/wordml" xmlns:w16du="http://schemas.microsoft.com/office/word/2023/wordml/word16du" xmlns:w16sdtdh="http://schemas.microsoft.com/office/word/2020/wordml/sdtdatahash" xmlns:w16sdtfl="http://schemas.microsoft.com/office/word/2024/wordml/sdtformatlock" xmlns:w16se="http://schemas.microsoft.com/office/word/2015/wordml/symex" xmlns:wpg="http://schemas.microsoft.com/office/word/2010/wordprocessingGroup" xmlns:wpi="http://schemas.microsoft.com/office/word/2010/wordprocessingInk" xmlns:wne="http://schemas.microsoft.com/office/word/2006/wordml" xmlns:wps="http://schemas.microsoft.com/office/word/2010/wordprocessingShape" mc:Ignorable="w14 w15 w16se w16cid w16 w16cex w16sdtdh w16sdtfl w16du wp14">
+  <w:comment w:id="17" w:author="Nickelberry, Marshae" w:date="2026-02-06T12:42:00Z" w:initials="NM">
+    <w:p>
+      <w:r>
+        <w:rPr>
+          <w:rStyle w:val="CommentReference"/>
+        </w:rPr>
+        <w:annotationRef/>
+      </w:r>
+      <w:r>
+        <w:rPr>
+          <w:sz w:val="20"/>
+          <w:szCs w:val="20"/>
+        </w:rPr>
+        <w:t>Figure is still quite blurry and bunched together</w:t>
+      </w:r>
+    </w:p>
+  </w:comment>
+  <w:comment w:id="18" w:author="Nickelberry, Marshae" w:date="2026-02-06T12:43:00Z" w:initials="NM">
+    <w:p>
+      <w:r>
+        <w:rPr>
+          <w:rStyle w:val="CommentReference"/>
+        </w:rPr>
+        <w:annotationRef/>
+      </w:r>
+      <w:r>
+        <w:rPr>
+          <w:sz w:val="20"/>
+          <w:szCs w:val="20"/>
+        </w:rPr>
+        <w:t>great attempt but please refer to FI and phthalate manuscript for formatting</w:t>
+      </w:r>
+    </w:p>
+  </w:comment>
+  <w:comment w:id="28" w:author="Nickelberry, Marshae" w:date="2026-02-06T12:45:00Z" w:initials="NM">
+    <w:p>
+      <w:r>
+        <w:rPr>
+          <w:rStyle w:val="CommentReference"/>
+        </w:rPr>
+        <w:annotationRef/>
+      </w:r>
+      <w:r>
+        <w:rPr>
+          <w:sz w:val="20"/>
+          <w:szCs w:val="20"/>
+        </w:rPr>
+        <w:t>This column is not needed</w:t>
+      </w:r>
+    </w:p>
+  </w:comment>
+  <w:comment w:id="36" w:author="Nickelberry, Marshae" w:date="2026-02-06T12:45:00Z" w:initials="NM">
+    <w:p>
+      <w:r>
+        <w:rPr>
+          <w:rStyle w:val="CommentReference"/>
+        </w:rPr>
+        <w:annotationRef/>
+      </w:r>
+      <w:r>
+        <w:rPr>
+          <w:sz w:val="20"/>
+          <w:szCs w:val="20"/>
+        </w:rPr>
+        <w:t xml:space="preserve">Please merge all tables and have one label across four rows. </w:t>
+      </w:r>
+    </w:p>
+  </w:comment>
+  <w:comment w:id="50" w:author="Nickelberry, Marshae" w:date="2026-02-06T12:44:00Z" w:initials="NM">
+    <w:p>
+      <w:r>
+        <w:rPr>
+          <w:rStyle w:val="CommentReference"/>
+        </w:rPr>
+        <w:annotationRef/>
+      </w:r>
+      <w:r>
+        <w:rPr>
+          <w:sz w:val="20"/>
+          <w:szCs w:val="20"/>
+        </w:rPr>
+        <w:t xml:space="preserve">Inconsistent title for categories-- lets stick with the same labeling for all tables. </w:t>
+      </w:r>
+    </w:p>
+  </w:comment>
+  <w:comment w:id="52" w:author="Nickelberry, Marshae" w:date="2026-02-06T12:43:00Z" w:initials="NM">
+    <w:p>
+      <w:r>
+        <w:rPr>
+          <w:rStyle w:val="CommentReference"/>
+        </w:rPr>
+        <w:annotationRef/>
+      </w:r>
+      <w:r>
+        <w:rPr>
+          <w:sz w:val="20"/>
+          <w:szCs w:val="20"/>
+        </w:rPr>
+        <w:t xml:space="preserve">Inconsistent text size. P value needs to be removed from all tables. </w:t>
+      </w:r>
+    </w:p>
+  </w:comment>
+  <w:comment w:id="55" w:author="Nickelberry, Marshae" w:date="2026-02-06T12:46:00Z" w:initials="NM">
+    <w:p>
+      <w:r>
+        <w:rPr>
+          <w:rStyle w:val="CommentReference"/>
+        </w:rPr>
+        <w:annotationRef/>
+      </w:r>
+      <w:r>
+        <w:rPr>
+          <w:sz w:val="20"/>
+          <w:szCs w:val="20"/>
+        </w:rPr>
+        <w:t>Same as above please use consistent text styles</w:t>
+      </w:r>
+    </w:p>
+  </w:comment>
+  <w:comment w:id="56" w:author="Nickelberry, Marshae" w:date="2026-02-06T12:46:00Z" w:initials="NM">
+    <w:p>
+      <w:r>
+        <w:rPr>
+          <w:rStyle w:val="CommentReference"/>
+        </w:rPr>
+        <w:annotationRef/>
+      </w:r>
+      <w:r>
+        <w:rPr>
+          <w:sz w:val="20"/>
+          <w:szCs w:val="20"/>
+        </w:rPr>
+        <w:t xml:space="preserve">delete p value column </w:t>
+      </w:r>
+    </w:p>
+  </w:comment>
+</w:comments>
+</file>
+
+<file path=word/commentsExtended.xml><?xml version="1.0" encoding="utf-8"?>
+<w15:commentsEx xmlns:wpc="http://schemas.microsoft.com/office/word/2010/wordprocessingCanvas" xmlns:cx="http://schemas.microsoft.com/office/drawing/2014/chartex" xmlns:cx1="http://schemas.microsoft.com/office/drawing/2015/9/8/chartex" xmlns:cx2="http://schemas.microsoft.com/office/drawing/2015/10/21/chartex" xmlns:cx3="http://schemas.microsoft.com/office/drawing/2016/5/9/chartex" xmlns:cx4="http://schemas.microsoft.com/office/drawing/2016/5/10/chartex" xmlns:cx5="http://schemas.microsoft.com/office/drawing/2016/5/11/chartex" xmlns:cx6="http://schemas.microsoft.com/office/drawing/2016/5/12/chartex" xmlns:cx7="http://schemas.microsoft.com/office/drawing/2016/5/13/chartex" xmlns:cx8="http://schemas.microsoft.com/office/drawing/2016/5/14/chartex" xmlns:mc="http://schemas.openxmlformats.org/markup-compatibility/2006" xmlns:aink="http://schemas.microsoft.com/office/drawing/2016/ink" xmlns:am3d="http://schemas.microsoft.com/office/drawing/2017/model3d" xmlns:o="urn:schemas-microsoft-com:office:office" xmlns:oel="http://schemas.microsoft.com/office/2019/extlst" xmlns:r="http://schemas.openxmlformats.org/officeDocument/2006/relationships" xmlns:m="http://schemas.openxmlformats.org/officeDocument/2006/math" xmlns:v="urn:schemas-microsoft-com:vml" xmlns:wp14="http://schemas.microsoft.com/office/word/2010/wordprocessingDrawing" xmlns:wp="http://schemas.openxmlformats.org/drawingml/2006/wordprocessingDrawing" xmlns:w10="urn:schemas-microsoft-com:office:word" xmlns:w="http://schemas.openxmlformats.org/wordprocessingml/2006/main" xmlns:w14="http://schemas.microsoft.com/office/word/2010/wordml" xmlns:w15="http://schemas.microsoft.com/office/word/2012/wordml" xmlns:w16cex="http://schemas.microsoft.com/office/word/2018/wordml/cex" xmlns:w16cid="http://schemas.microsoft.com/office/word/2016/wordml/cid" xmlns:w16="http://schemas.microsoft.com/office/word/2018/wordml" xmlns:w16du="http://schemas.microsoft.com/office/word/2023/wordml/word16du" xmlns:w16sdtdh="http://schemas.microsoft.com/office/word/2020/wordml/sdtdatahash" xmlns:w16sdtfl="http://schemas.microsoft.com/office/word/2024/wordml/sdtformatlock" xmlns:w16se="http://schemas.microsoft.com/office/word/2015/wordml/symex" xmlns:wpg="http://schemas.microsoft.com/office/word/2010/wordprocessingGroup" xmlns:wpi="http://schemas.microsoft.com/office/word/2010/wordprocessingInk" xmlns:wne="http://schemas.microsoft.com/office/word/2006/wordml" xmlns:wps="http://schemas.microsoft.com/office/word/2010/wordprocessingShape" mc:Ignorable="w14 w15 w16se w16cid w16 w16cex w16sdtdh w16sdtfl w16du wp14">
+  <w15:commentEx w15:paraId="6583A7B8" w15:done="0"/>
+  <w15:commentEx w15:paraId="5C9E6D75" w15:done="0"/>
+  <w15:commentEx w15:paraId="41275568" w15:done="0"/>
+  <w15:commentEx w15:paraId="4B530D34" w15:done="0"/>
+  <w15:commentEx w15:paraId="33934FC2" w15:done="0"/>
+  <w15:commentEx w15:paraId="33E8B581" w15:done="0"/>
+  <w15:commentEx w15:paraId="5EB02717" w15:done="0"/>
+  <w15:commentEx w15:paraId="1296719B" w15:done="0"/>
+</w15:commentsEx>
+</file>
+
+<file path=word/commentsExtensible.xml><?xml version="1.0" encoding="utf-8"?>
+<w16cex:commentsExtensible xmlns:wpc="http://schemas.microsoft.com/office/word/2010/wordprocessingCanvas" xmlns:cx="http://schemas.microsoft.com/office/drawing/2014/chartex" xmlns:cx1="http://schemas.microsoft.com/office/drawing/2015/9/8/chartex" xmlns:cx2="http://schemas.microsoft.com/office/drawing/2015/10/21/chartex" xmlns:cx3="http://schemas.microsoft.com/office/drawing/2016/5/9/chartex" xmlns:cx4="http://schemas.microsoft.com/office/drawing/2016/5/10/chartex" xmlns:cx5="http://schemas.microsoft.com/office/drawing/2016/5/11/chartex" xmlns:cx6="http://schemas.microsoft.com/office/drawing/2016/5/12/chartex" xmlns:cx7="http://schemas.microsoft.com/office/drawing/2016/5/13/chartex" xmlns:cx8="http://schemas.microsoft.com/office/drawing/2016/5/14/chartex" xmlns:cr="http://schemas.microsoft.com/office/comments/2020/reactions" xmlns:mc="http://schemas.openxmlformats.org/markup-compatibility/2006" xmlns:aink="http://schemas.microsoft.com/office/drawing/2016/ink" xmlns:am3d="http://schemas.microsoft.com/office/drawing/2017/model3d" xmlns:o="urn:schemas-microsoft-com:office:office" xmlns:oel="http://schemas.microsoft.com/office/2019/extlst" xmlns:r="http://schemas.openxmlformats.org/officeDocument/2006/relationships" xmlns:m="http://schemas.openxmlformats.org/officeDocument/2006/math" xmlns:v="urn:schemas-microsoft-com:vml" xmlns:wp14="http://schemas.microsoft.com/office/word/2010/wordprocessingDrawing" xmlns:wp="http://schemas.openxmlformats.org/drawingml/2006/wordprocessingDrawing" xmlns:w10="urn:schemas-microsoft-com:office:word" xmlns:w="http://schemas.openxmlformats.org/wordprocessingml/2006/main" xmlns:w14="http://schemas.microsoft.com/office/word/2010/wordml" xmlns:w15="http://schemas.microsoft.com/office/word/2012/wordml" xmlns:w16cex="http://schemas.microsoft.com/office/word/2018/wordml/cex" xmlns:w16cid="http://schemas.microsoft.com/office/word/2016/wordml/cid" xmlns:w16="http://schemas.microsoft.com/office/word/2018/wordml" xmlns:w16du="http://schemas.microsoft.com/office/word/2023/wordml/word16du" xmlns:w16sdtdh="http://schemas.microsoft.com/office/word/2020/wordml/sdtdatahash" xmlns:w16sdtfl="http://schemas.microsoft.com/office/word/2024/wordml/sdtformatlock" xmlns:w16se="http://schemas.microsoft.com/office/word/2015/wordml/symex" xmlns:wpg="http://schemas.microsoft.com/office/word/2010/wordprocessingGroup" xmlns:wpi="http://schemas.microsoft.com/office/word/2010/wordprocessingInk" xmlns:wne="http://schemas.microsoft.com/office/word/2006/wordml" xmlns:wps="http://schemas.microsoft.com/office/word/2010/wordprocessingShape" mc:Ignorable="w14 w15 w16se w16cid w16 w16cex w16sdtdh w16sdtfl cr w16du wp14">
+  <w16cex:commentExtensible w16cex:durableId="76BA3A4C" w16cex:dateUtc="2026-02-06T17:42:00Z"/>
+  <w16cex:commentExtensible w16cex:durableId="58A3B83D" w16cex:dateUtc="2026-02-06T17:43:00Z"/>
+  <w16cex:commentExtensible w16cex:durableId="02AABC60" w16cex:dateUtc="2026-02-06T17:45:00Z"/>
+  <w16cex:commentExtensible w16cex:durableId="32B49E14" w16cex:dateUtc="2026-02-06T17:45:00Z"/>
+  <w16cex:commentExtensible w16cex:durableId="5681235D" w16cex:dateUtc="2026-02-06T17:44:00Z"/>
+  <w16cex:commentExtensible w16cex:durableId="5E28E5AD" w16cex:dateUtc="2026-02-06T17:43:00Z"/>
+  <w16cex:commentExtensible w16cex:durableId="46CDB3FE" w16cex:dateUtc="2026-02-06T17:46:00Z"/>
+  <w16cex:commentExtensible w16cex:durableId="16B46473" w16cex:dateUtc="2026-02-06T17:46:00Z"/>
+</w16cex:commentsExtensible>
+</file>
+
+<file path=word/commentsIds.xml><?xml version="1.0" encoding="utf-8"?>
+<w16cid:commentsIds xmlns:wpc="http://schemas.microsoft.com/office/word/2010/wordprocessingCanvas" xmlns:cx="http://schemas.microsoft.com/office/drawing/2014/chartex" xmlns:cx1="http://schemas.microsoft.com/office/drawing/2015/9/8/chartex" xmlns:cx2="http://schemas.microsoft.com/office/drawing/2015/10/21/chartex" xmlns:cx3="http://schemas.microsoft.com/office/drawing/2016/5/9/chartex" xmlns:cx4="http://schemas.microsoft.com/office/drawing/2016/5/10/chartex" xmlns:cx5="http://schemas.microsoft.com/office/drawing/2016/5/11/chartex" xmlns:cx6="http://schemas.microsoft.com/office/drawing/2016/5/12/chartex" xmlns:cx7="http://schemas.microsoft.com/office/drawing/2016/5/13/chartex" xmlns:cx8="http://schemas.microsoft.com/office/drawing/2016/5/14/chartex" xmlns:mc="http://schemas.openxmlformats.org/markup-compatibility/2006" xmlns:aink="http://schemas.microsoft.com/office/drawing/2016/ink" xmlns:am3d="http://schemas.microsoft.com/office/drawing/2017/model3d" xmlns:o="urn:schemas-microsoft-com:office:office" xmlns:oel="http://schemas.microsoft.com/office/2019/extlst" xmlns:r="http://schemas.openxmlformats.org/officeDocument/2006/relationships" xmlns:m="http://schemas.openxmlformats.org/officeDocument/2006/math" xmlns:v="urn:schemas-microsoft-com:vml" xmlns:wp14="http://schemas.microsoft.com/office/word/2010/wordprocessingDrawing" xmlns:wp="http://schemas.openxmlformats.org/drawingml/2006/wordprocessingDrawing" xmlns:w10="urn:schemas-microsoft-com:office:word" xmlns:w="http://schemas.openxmlformats.org/wordprocessingml/2006/main" xmlns:w14="http://schemas.microsoft.com/office/word/2010/wordml" xmlns:w15="http://schemas.microsoft.com/office/word/2012/wordml" xmlns:w16cex="http://schemas.microsoft.com/office/word/2018/wordml/cex" xmlns:w16cid="http://schemas.microsoft.com/office/word/2016/wordml/cid" xmlns:w16="http://schemas.microsoft.com/office/word/2018/wordml" xmlns:w16du="http://schemas.microsoft.com/office/word/2023/wordml/word16du" xmlns:w16sdtdh="http://schemas.microsoft.com/office/word/2020/wordml/sdtdatahash" xmlns:w16sdtfl="http://schemas.microsoft.com/office/word/2024/wordml/sdtformatlock" xmlns:w16se="http://schemas.microsoft.com/office/word/2015/wordml/symex" xmlns:wpg="http://schemas.microsoft.com/office/word/2010/wordprocessingGroup" xmlns:wpi="http://schemas.microsoft.com/office/word/2010/wordprocessingInk" xmlns:wne="http://schemas.microsoft.com/office/word/2006/wordml" xmlns:wps="http://schemas.microsoft.com/office/word/2010/wordprocessingShape" mc:Ignorable="w14 w15 w16se w16cid w16 w16cex w16sdtdh w16sdtfl w16du wp14">
+  <w16cid:commentId w16cid:paraId="6583A7B8" w16cid:durableId="76BA3A4C"/>
+  <w16cid:commentId w16cid:paraId="5C9E6D75" w16cid:durableId="58A3B83D"/>
+  <w16cid:commentId w16cid:paraId="41275568" w16cid:durableId="02AABC60"/>
+  <w16cid:commentId w16cid:paraId="4B530D34" w16cid:durableId="32B49E14"/>
+  <w16cid:commentId w16cid:paraId="33934FC2" w16cid:durableId="5681235D"/>
+  <w16cid:commentId w16cid:paraId="33E8B581" w16cid:durableId="5E28E5AD"/>
+  <w16cid:commentId w16cid:paraId="5EB02717" w16cid:durableId="46CDB3FE"/>
+  <w16cid:commentId w16cid:paraId="1296719B" w16cid:durableId="16B46473"/>
+</w16cid:commentsIds>
 </file>
 
 <file path=word/endnotes.xml><?xml version="1.0" encoding="utf-8"?>
@@ -46768,6 +47642,14 @@
     <w:abstractNumId w:val="46"/>
   </w:num>
 </w:numbering>
+</file>
+
+<file path=word/people.xml><?xml version="1.0" encoding="utf-8"?>
+<w15:people xmlns:wpc="http://schemas.microsoft.com/office/word/2010/wordprocessingCanvas" xmlns:cx="http://schemas.microsoft.com/office/drawing/2014/chartex" xmlns:cx1="http://schemas.microsoft.com/office/drawing/2015/9/8/chartex" xmlns:cx2="http://schemas.microsoft.com/office/drawing/2015/10/21/chartex" xmlns:cx3="http://schemas.microsoft.com/office/drawing/2016/5/9/chartex" xmlns:cx4="http://schemas.microsoft.com/office/drawing/2016/5/10/chartex" xmlns:cx5="http://schemas.microsoft.com/office/drawing/2016/5/11/chartex" xmlns:cx6="http://schemas.microsoft.com/office/drawing/2016/5/12/chartex" xmlns:cx7="http://schemas.microsoft.com/office/drawing/2016/5/13/chartex" xmlns:cx8="http://schemas.microsoft.com/office/drawing/2016/5/14/chartex" xmlns:mc="http://schemas.openxmlformats.org/markup-compatibility/2006" xmlns:aink="http://schemas.microsoft.com/office/drawing/2016/ink" xmlns:am3d="http://schemas.microsoft.com/office/drawing/2017/model3d" xmlns:o="urn:schemas-microsoft-com:office:office" xmlns:oel="http://schemas.microsoft.com/office/2019/extlst" xmlns:r="http://schemas.openxmlformats.org/officeDocument/2006/relationships" xmlns:m="http://schemas.openxmlformats.org/officeDocument/2006/math" xmlns:v="urn:schemas-microsoft-com:vml" xmlns:wp14="http://schemas.microsoft.com/office/word/2010/wordprocessingDrawing" xmlns:wp="http://schemas.openxmlformats.org/drawingml/2006/wordprocessingDrawing" xmlns:w10="urn:schemas-microsoft-com:office:word" xmlns:w="http://schemas.openxmlformats.org/wordprocessingml/2006/main" xmlns:w14="http://schemas.microsoft.com/office/word/2010/wordml" xmlns:w15="http://schemas.microsoft.com/office/word/2012/wordml" xmlns:w16cex="http://schemas.microsoft.com/office/word/2018/wordml/cex" xmlns:w16cid="http://schemas.microsoft.com/office/word/2016/wordml/cid" xmlns:w16="http://schemas.microsoft.com/office/word/2018/wordml" xmlns:w16du="http://schemas.microsoft.com/office/word/2023/wordml/word16du" xmlns:w16sdtdh="http://schemas.microsoft.com/office/word/2020/wordml/sdtdatahash" xmlns:w16sdtfl="http://schemas.microsoft.com/office/word/2024/wordml/sdtformatlock" xmlns:w16se="http://schemas.microsoft.com/office/word/2015/wordml/symex" xmlns:wpg="http://schemas.microsoft.com/office/word/2010/wordprocessingGroup" xmlns:wpi="http://schemas.microsoft.com/office/word/2010/wordprocessingInk" xmlns:wne="http://schemas.microsoft.com/office/word/2006/wordml" xmlns:wps="http://schemas.microsoft.com/office/word/2010/wordprocessingShape" mc:Ignorable="w14 w15 w16se w16cid w16 w16cex w16sdtdh w16sdtfl w16du wp14">
+  <w15:person w15:author="Nickelberry, Marshae">
+    <w15:presenceInfo w15:providerId="AD" w15:userId="S::mnickelberry@hsph.harvard.edu::0384a47c-4158-47fc-9cd1-eb73687c7198"/>
+  </w15:person>
+</w15:people>
 </file>
 
 <file path=word/styles.xml><?xml version="1.0" encoding="utf-8"?>

</xml_diff>